<commit_message>
Auto-save: 3 file(s) — 2026-10-12 13:25
</commit_message>
<xml_diff>
--- a/Projects/TekRevol/03-website/TekRevol-Strata-Method-v1.docx
+++ b/Projects/TekRevol/03-website/TekRevol-Strata-Method-v1.docx
@@ -6,8 +6,6 @@
       <w:pPr>
         <w:spacing w:before="2400" w:after="120"/>
       </w:pPr>
-      <w:bookmarkStart w:id="0" w:name="_GoBack"/>
-      <w:bookmarkEnd w:id="0"/>
       <w:r>
         <w:rPr>
           <w:rFonts w:ascii="JetBrains Mono" w:eastAsia="JetBrains Mono" w:hAnsi="JetBrains Mono" w:cs="JetBrains Mono"/>
@@ -34,22 +32,6 @@
     </w:p>
     <w:p>
       <w:pPr>
-        <w:pBdr>
-          <w:bottom w:val="single" w:sz="24" w:space="8" w:color="FF4A1C"/>
-        </w:pBdr>
-        <w:spacing w:after="600"/>
-      </w:pPr>
-      <w:r>
-        <w:rPr>
-          <w:color w:val="5E6166"/>
-          <w:sz w:val="24"/>
-          <w:szCs w:val="24"/>
-        </w:rPr>
-        <w:t>Explore fast. Ship deliberately. · Proposal v1 · 12 October 2026</w:t>
-      </w:r>
-    </w:p>
-    <w:p>
-      <w:pPr>
         <w:spacing w:after="120" w:line="300" w:lineRule="auto"/>
       </w:pPr>
       <w:r>
@@ -60,55 +42,23 @@
         <w:t>What this is:</w:t>
       </w:r>
       <w:r>
-        <w:t xml:space="preserve"> a proposed signature framework for how TekRevol delivers software with AI. It is meant to set TekRevol apart on the website, in proposals and in AI search answers.</w:t>
-      </w:r>
-    </w:p>
-    <w:p>
-      <w:pPr>
-        <w:spacing w:after="120" w:line="300" w:lineRule="auto"/>
-      </w:pPr>
-      <w:r>
-        <w:rPr>
-          <w:b/>
-          <w:bCs/>
-        </w:rPr>
-        <w:t>Status:</w:t>
-      </w:r>
-      <w:r>
-        <w:t xml:space="preserve"> direction and name approved by Sana. The details of each stage are a proposal until</w:t>
-      </w:r>
-      <w:r>
-        <w:t xml:space="preserve"> TekRevol delivery confirms them. Items marked </w:t>
-      </w:r>
-      <w:r>
-        <w:rPr>
-          <w:rFonts w:ascii="JetBrains Mono" w:eastAsia="JetBrains Mono" w:hAnsi="JetBrains Mono" w:cs="JetBrains Mono"/>
-          <w:b/>
-          <w:bCs/>
-          <w:color w:val="C23A00"/>
-          <w:sz w:val="17"/>
-          <w:szCs w:val="17"/>
-          <w:shd w:val="clear" w:color="auto" w:fill="FFE8E0"/>
-        </w:rPr>
-        <w:t>[CONFIRM]</w:t>
-      </w:r>
-      <w:r>
-        <w:t xml:space="preserve"> need an answer from project managers or the CTO.</w:t>
-      </w:r>
-    </w:p>
-    <w:p>
-      <w:pPr>
-        <w:spacing w:after="120" w:line="300" w:lineRule="auto"/>
-      </w:pPr>
-      <w:r>
-        <w:rPr>
-          <w:b/>
-          <w:bCs/>
-        </w:rPr>
-        <w:t>What we need from you:</w:t>
-      </w:r>
-      <w:r>
-        <w:t xml:space="preserve"> read sections 2 and 4, then answer the 13 questions in section 6.</w:t>
+        <w:t xml:space="preserve"> a proposed signature framework for how </w:t>
+      </w:r>
+      <w:proofErr w:type="spellStart"/>
+      <w:r>
+        <w:t>TekRevol</w:t>
+      </w:r>
+      <w:proofErr w:type="spellEnd"/>
+      <w:r>
+        <w:t xml:space="preserve"> delivers software with AI. It is meant to set </w:t>
+      </w:r>
+      <w:proofErr w:type="spellStart"/>
+      <w:r>
+        <w:t>TekRevol</w:t>
+      </w:r>
+      <w:proofErr w:type="spellEnd"/>
+      <w:r>
+        <w:t xml:space="preserve"> apart on the website, in proposals and in AI search answers.</w:t>
       </w:r>
     </w:p>
     <w:p>
@@ -128,7 +78,28 @@
           <w:sz w:val="36"/>
           <w:szCs w:val="36"/>
         </w:rPr>
-        <w:t>1. Why TekRevol needs its own framework</w:t>
+        <w:lastRenderedPageBreak/>
+        <w:t xml:space="preserve">1. Why </w:t>
+      </w:r>
+      <w:proofErr w:type="spellStart"/>
+      <w:r>
+        <w:rPr>
+          <w:rFonts w:ascii="Funnel Display" w:eastAsia="Funnel Display" w:hAnsi="Funnel Display" w:cs="Funnel Display"/>
+          <w:color w:val="1D1E21"/>
+          <w:sz w:val="36"/>
+          <w:szCs w:val="36"/>
+        </w:rPr>
+        <w:t>TekRevol</w:t>
+      </w:r>
+      <w:proofErr w:type="spellEnd"/>
+      <w:r>
+        <w:rPr>
+          <w:rFonts w:ascii="Funnel Display" w:eastAsia="Funnel Display" w:hAnsi="Funnel Display" w:cs="Funnel Display"/>
+          <w:color w:val="1D1E21"/>
+          <w:sz w:val="36"/>
+          <w:szCs w:val="36"/>
+        </w:rPr>
+        <w:t xml:space="preserve"> needs its own framework</w:t>
       </w:r>
     </w:p>
     <w:p>
@@ -136,10 +107,7 @@
         <w:spacing w:after="120" w:line="300" w:lineRule="auto"/>
       </w:pPr>
       <w:r>
-        <w:t>Competitors have st</w:t>
-      </w:r>
-      <w:r>
-        <w:t>arted naming how they deliver with AI. A named method gives buyers something to remember, gives a champion something to take to leadership, and gives AI engines a definition to quote.</w:t>
+        <w:t>Competitors have started naming how they deliver with AI. A named method gives buyers something to remember, gives a champion something to take to leadership, and gives AI engines a definition to quote.</w:t>
       </w:r>
     </w:p>
     <w:tbl>
@@ -282,6 +250,7 @@
             <w:pPr>
               <w:spacing w:line="270" w:lineRule="auto"/>
             </w:pPr>
+            <w:proofErr w:type="spellStart"/>
             <w:r>
               <w:rPr>
                 <w:sz w:val="18"/>
@@ -289,6 +258,7 @@
               </w:rPr>
               <w:t>HatchWorks</w:t>
             </w:r>
+            <w:proofErr w:type="spellEnd"/>
           </w:p>
         </w:tc>
         <w:tc>
@@ -311,6 +281,7 @@
             <w:pPr>
               <w:spacing w:line="270" w:lineRule="auto"/>
             </w:pPr>
+            <w:proofErr w:type="spellStart"/>
             <w:r>
               <w:rPr>
                 <w:b/>
@@ -320,12 +291,29 @@
               </w:rPr>
               <w:t>GenDD</w:t>
             </w:r>
-            <w:r>
-              <w:rPr>
-                <w:sz w:val="18"/>
-                <w:szCs w:val="18"/>
-              </w:rPr>
-              <w:t xml:space="preserve"> (Generative-Driven Development), with a manifesto, an ebook and a 2026 award</w:t>
+            <w:proofErr w:type="spellEnd"/>
+            <w:r>
+              <w:rPr>
+                <w:sz w:val="18"/>
+                <w:szCs w:val="18"/>
+              </w:rPr>
+              <w:t xml:space="preserve"> (Generative-Driven Development), with a manifesto, an </w:t>
+            </w:r>
+            <w:proofErr w:type="spellStart"/>
+            <w:r>
+              <w:rPr>
+                <w:sz w:val="18"/>
+                <w:szCs w:val="18"/>
+              </w:rPr>
+              <w:t>ebook</w:t>
+            </w:r>
+            <w:proofErr w:type="spellEnd"/>
+            <w:r>
+              <w:rPr>
+                <w:sz w:val="18"/>
+                <w:szCs w:val="18"/>
+              </w:rPr>
+              <w:t xml:space="preserve"> and a 2026 award</w:t>
             </w:r>
           </w:p>
         </w:tc>
@@ -478,6 +466,7 @@
             <w:pPr>
               <w:spacing w:line="270" w:lineRule="auto"/>
             </w:pPr>
+            <w:proofErr w:type="spellStart"/>
             <w:r>
               <w:rPr>
                 <w:sz w:val="18"/>
@@ -485,6 +474,7 @@
               </w:rPr>
               <w:t>BluTech</w:t>
             </w:r>
+            <w:proofErr w:type="spellEnd"/>
           </w:p>
         </w:tc>
         <w:tc>
@@ -567,13 +557,31 @@
             <w:pPr>
               <w:spacing w:line="270" w:lineRule="auto"/>
             </w:pPr>
-            <w:r>
-              <w:rPr>
-                <w:sz w:val="18"/>
-                <w:szCs w:val="18"/>
-              </w:rPr>
-              <w:t>Azumo, LeewayHertz</w:t>
-            </w:r>
+            <w:proofErr w:type="spellStart"/>
+            <w:r>
+              <w:rPr>
+                <w:sz w:val="18"/>
+                <w:szCs w:val="18"/>
+              </w:rPr>
+              <w:t>Azumo</w:t>
+            </w:r>
+            <w:proofErr w:type="spellEnd"/>
+            <w:r>
+              <w:rPr>
+                <w:sz w:val="18"/>
+                <w:szCs w:val="18"/>
+              </w:rPr>
+              <w:t xml:space="preserve">, </w:t>
+            </w:r>
+            <w:proofErr w:type="spellStart"/>
+            <w:r>
+              <w:rPr>
+                <w:sz w:val="18"/>
+                <w:szCs w:val="18"/>
+              </w:rPr>
+              <w:t>LeewayHertz</w:t>
+            </w:r>
+            <w:proofErr w:type="spellEnd"/>
           </w:p>
         </w:tc>
         <w:tc>
@@ -665,14 +673,7 @@
           <w:b/>
           <w:bCs/>
         </w:rPr>
-        <w:t>Eve</w:t>
-      </w:r>
-      <w:r>
-        <w:rPr>
-          <w:b/>
-          <w:bCs/>
-        </w:rPr>
-        <w:t>ry competitor framework is a straight line.</w:t>
+        <w:t>Every competitor framework is a straight line.</w:t>
       </w:r>
       <w:r>
         <w:t xml:space="preserve"> None separates exploring from shipping. That is exactly where AI-built software breaks: AI makes a demo cheap, but production still takes engineering</w:t>
@@ -695,10 +696,7 @@
         <w:t>Nobody names the gate.</w:t>
       </w:r>
       <w:r>
-        <w:t xml:space="preserve"> No one says when a prototype becomes pr</w:t>
-      </w:r>
-      <w:r>
-        <w:t>oduction work, or what it has to pass</w:t>
+        <w:t xml:space="preserve"> No one says when a prototype becomes production work, or what it has to pass</w:t>
       </w:r>
     </w:p>
     <w:p>
@@ -731,7 +729,15 @@
         <w:spacing w:after="80" w:line="290" w:lineRule="auto"/>
       </w:pPr>
       <w:r>
-        <w:t>"Humans plus AI agents" is already expected. Cheesecake Labs owns that line, so TekRevol should not lead with it</w:t>
+        <w:t xml:space="preserve">"Humans plus AI agents" is already expected. Cheesecake Labs owns that line, so </w:t>
+      </w:r>
+      <w:proofErr w:type="spellStart"/>
+      <w:r>
+        <w:t>TekRevol</w:t>
+      </w:r>
+      <w:proofErr w:type="spellEnd"/>
+      <w:r>
+        <w:t xml:space="preserve"> should not lead with it</w:t>
       </w:r>
     </w:p>
     <w:p>
@@ -761,7 +767,7 @@
           <w:sz w:val="16"/>
           <w:szCs w:val="16"/>
         </w:rPr>
-        <w:t>DEFINITION (USE THIS EXACT SENTENCE EVERYWHERE)</w:t>
+        <w:t xml:space="preserve">DEFINITION </w:t>
       </w:r>
     </w:p>
     <w:p>
@@ -777,7 +783,23 @@
           <w:sz w:val="22"/>
           <w:szCs w:val="22"/>
         </w:rPr>
-        <w:t>The Strata Method is TekRevol's AI-native delivery framework: explore fast with AI, cross the Ship Line only when the work meets production standard, and build in layers that make every next build better.</w:t>
+        <w:t xml:space="preserve">The Strata Method is </w:t>
+      </w:r>
+      <w:proofErr w:type="spellStart"/>
+      <w:r>
+        <w:rPr>
+          <w:sz w:val="22"/>
+          <w:szCs w:val="22"/>
+        </w:rPr>
+        <w:t>TekRevol's</w:t>
+      </w:r>
+      <w:proofErr w:type="spellEnd"/>
+      <w:r>
+        <w:rPr>
+          <w:sz w:val="22"/>
+          <w:szCs w:val="22"/>
+        </w:rPr>
+        <w:t xml:space="preserve"> AI-native delivery framework: explore fast with AI, cross the Ship Line only when the work meets production standard, and build in layers that make every next build better.</w:t>
       </w:r>
     </w:p>
     <w:p>
@@ -816,107 +838,39 @@
       <w:pPr>
         <w:pStyle w:val="Heading2"/>
         <w:spacing w:before="280" w:after="100"/>
-      </w:pPr>
-      <w:r>
         <w:rPr>
           <w:rFonts w:ascii="Funnel Display" w:eastAsia="Funnel Display" w:hAnsi="Funnel Display" w:cs="Funnel Display"/>
           <w:color w:val="1D1E21"/>
           <w:sz w:val="28"/>
           <w:szCs w:val="28"/>
         </w:rPr>
-        <w:t>Two modes, one line between them</w:t>
-      </w:r>
+      </w:pPr>
     </w:p>
     <w:p>
       <w:pPr>
-        <w:pStyle w:val="ListParagraph"/>
-        <w:numPr>
-          <w:ilvl w:val="0"/>
-          <w:numId w:val="2"/>
-        </w:numPr>
-        <w:spacing w:after="80" w:line="290" w:lineRule="auto"/>
-      </w:pPr>
-      <w:r>
-        <w:rPr>
-          <w:b/>
-          <w:bCs/>
-        </w:rPr>
-        <w:t>Explore (cyan).</w:t>
-      </w:r>
-      <w:r>
-        <w:t xml:space="preserve"> AI does the heavy lifting: research, options, prototypes. Cheap to try, cheap to throw away</w:t>
-      </w:r>
-    </w:p>
-    <w:p>
-      <w:pPr>
-        <w:pStyle w:val="ListParagraph"/>
-        <w:numPr>
-          <w:ilvl w:val="0"/>
-          <w:numId w:val="2"/>
-        </w:numPr>
-        <w:spacing w:after="80" w:line="290" w:lineRule="auto"/>
-      </w:pPr>
-      <w:r>
-        <w:rPr>
-          <w:b/>
-          <w:bCs/>
-        </w:rPr>
-        <w:t>The Ship Line (orange).</w:t>
-      </w:r>
-      <w:r>
-        <w:t xml:space="preserve"> The gate. Nothing becomes production work u</w:t>
-      </w:r>
-      <w:r>
-        <w:t>ntil it passes the Build Standard checks</w:t>
-      </w:r>
-    </w:p>
-    <w:p>
-      <w:pPr>
-        <w:pStyle w:val="ListParagraph"/>
-        <w:numPr>
-          <w:ilvl w:val="0"/>
-          <w:numId w:val="2"/>
-        </w:numPr>
-        <w:spacing w:after="80" w:line="290" w:lineRule="auto"/>
-      </w:pPr>
-      <w:r>
-        <w:rPr>
-          <w:b/>
-          <w:bCs/>
-        </w:rPr>
-        <w:t>Ship (orange).</w:t>
-      </w:r>
-      <w:r>
-        <w:t xml:space="preserve"> Engineers own every decision. Built layer by layer, each one production-grade before the next goes on top</w:t>
-      </w:r>
-    </w:p>
-    <w:p>
-      <w:pPr>
-        <w:spacing w:after="120"/>
-      </w:pPr>
-      <w:r>
-        <w:rPr>
-          <w:i/>
-          <w:iCs/>
-          <w:color w:val="5E6166"/>
-          <w:sz w:val="18"/>
-          <w:szCs w:val="18"/>
-        </w:rPr>
-        <w:t>This is the existing brand rule, word for word: "cyan explores, orange ships."</w:t>
-      </w:r>
-    </w:p>
-    <w:p>
-      <w:pPr>
         <w:pStyle w:val="Heading2"/>
         <w:spacing w:before="280" w:after="100"/>
-      </w:pPr>
-      <w:r>
         <w:rPr>
           <w:rFonts w:ascii="Funnel Display" w:eastAsia="Funnel Display" w:hAnsi="Funnel Display" w:cs="Funnel Display"/>
           <w:color w:val="1D1E21"/>
           <w:sz w:val="28"/>
           <w:szCs w:val="28"/>
         </w:rPr>
+      </w:pPr>
+    </w:p>
+    <w:p>
+      <w:pPr>
+        <w:pStyle w:val="Heading2"/>
+        <w:spacing w:before="280" w:after="100"/>
+      </w:pPr>
+      <w:r>
+        <w:rPr>
+          <w:rFonts w:ascii="Funnel Display" w:eastAsia="Funnel Display" w:hAnsi="Funnel Display" w:cs="Funnel Display"/>
+          <w:color w:val="1D1E21"/>
+          <w:sz w:val="28"/>
+          <w:szCs w:val="28"/>
+        </w:rPr>
+        <w:lastRenderedPageBreak/>
         <w:t>Five stages</w:t>
       </w:r>
     </w:p>
@@ -972,8 +926,31 @@
                 <w:sz w:val="16"/>
                 <w:szCs w:val="16"/>
               </w:rPr>
-              <w:t>Mod</w:t>
-            </w:r>
+              <w:t>Mode</w:t>
+            </w:r>
+          </w:p>
+        </w:tc>
+        <w:tc>
+          <w:tcPr>
+            <w:tcW w:w="1400" w:type="dxa"/>
+            <w:tcBorders>
+              <w:top w:val="single" w:sz="4" w:space="0" w:color="C9CCCF"/>
+              <w:left w:val="single" w:sz="4" w:space="0" w:color="C9CCCF"/>
+              <w:bottom w:val="single" w:sz="4" w:space="0" w:color="C9CCCF"/>
+              <w:right w:val="single" w:sz="4" w:space="0" w:color="C9CCCF"/>
+            </w:tcBorders>
+            <w:shd w:val="clear" w:color="auto" w:fill="1D1E21"/>
+            <w:tcMar>
+              <w:top w:w="80" w:type="dxa"/>
+              <w:left w:w="110" w:type="dxa"/>
+              <w:bottom w:w="80" w:type="dxa"/>
+              <w:right w:w="110" w:type="dxa"/>
+            </w:tcMar>
+          </w:tcPr>
+          <w:p>
+            <w:pPr>
+              <w:spacing w:line="270" w:lineRule="auto"/>
+            </w:pPr>
             <w:r>
               <w:rPr>
                 <w:rFonts w:ascii="JetBrains Mono" w:eastAsia="JetBrains Mono" w:hAnsi="JetBrains Mono" w:cs="JetBrains Mono"/>
@@ -981,13 +958,13 @@
                 <w:sz w:val="16"/>
                 <w:szCs w:val="16"/>
               </w:rPr>
-              <w:t>e</w:t>
-            </w:r>
-          </w:p>
-        </w:tc>
-        <w:tc>
-          <w:tcPr>
-            <w:tcW w:w="1400" w:type="dxa"/>
+              <w:t>Stage</w:t>
+            </w:r>
+          </w:p>
+        </w:tc>
+        <w:tc>
+          <w:tcPr>
+            <w:tcW w:w="2500" w:type="dxa"/>
             <w:tcBorders>
               <w:top w:val="single" w:sz="4" w:space="0" w:color="C9CCCF"/>
               <w:left w:val="single" w:sz="4" w:space="0" w:color="C9CCCF"/>
@@ -1013,13 +990,13 @@
                 <w:sz w:val="16"/>
                 <w:szCs w:val="16"/>
               </w:rPr>
-              <w:t>Stage</w:t>
-            </w:r>
-          </w:p>
-        </w:tc>
-        <w:tc>
-          <w:tcPr>
-            <w:tcW w:w="2500" w:type="dxa"/>
+              <w:t>AI does</w:t>
+            </w:r>
+          </w:p>
+        </w:tc>
+        <w:tc>
+          <w:tcPr>
+            <w:tcW w:w="2360" w:type="dxa"/>
             <w:tcBorders>
               <w:top w:val="single" w:sz="4" w:space="0" w:color="C9CCCF"/>
               <w:left w:val="single" w:sz="4" w:space="0" w:color="C9CCCF"/>
@@ -1045,13 +1022,13 @@
                 <w:sz w:val="16"/>
                 <w:szCs w:val="16"/>
               </w:rPr>
-              <w:t>AI does</w:t>
-            </w:r>
-          </w:p>
-        </w:tc>
-        <w:tc>
-          <w:tcPr>
-            <w:tcW w:w="2360" w:type="dxa"/>
+              <w:t>Engineers own</w:t>
+            </w:r>
+          </w:p>
+        </w:tc>
+        <w:tc>
+          <w:tcPr>
+            <w:tcW w:w="2200" w:type="dxa"/>
             <w:tcBorders>
               <w:top w:val="single" w:sz="4" w:space="0" w:color="C9CCCF"/>
               <w:left w:val="single" w:sz="4" w:space="0" w:color="C9CCCF"/>
@@ -1077,38 +1054,6 @@
                 <w:sz w:val="16"/>
                 <w:szCs w:val="16"/>
               </w:rPr>
-              <w:t>Engineers own</w:t>
-            </w:r>
-          </w:p>
-        </w:tc>
-        <w:tc>
-          <w:tcPr>
-            <w:tcW w:w="2200" w:type="dxa"/>
-            <w:tcBorders>
-              <w:top w:val="single" w:sz="4" w:space="0" w:color="C9CCCF"/>
-              <w:left w:val="single" w:sz="4" w:space="0" w:color="C9CCCF"/>
-              <w:bottom w:val="single" w:sz="4" w:space="0" w:color="C9CCCF"/>
-              <w:right w:val="single" w:sz="4" w:space="0" w:color="C9CCCF"/>
-            </w:tcBorders>
-            <w:shd w:val="clear" w:color="auto" w:fill="1D1E21"/>
-            <w:tcMar>
-              <w:top w:w="80" w:type="dxa"/>
-              <w:left w:w="110" w:type="dxa"/>
-              <w:bottom w:w="80" w:type="dxa"/>
-              <w:right w:w="110" w:type="dxa"/>
-            </w:tcMar>
-          </w:tcPr>
-          <w:p>
-            <w:pPr>
-              <w:spacing w:line="270" w:lineRule="auto"/>
-            </w:pPr>
-            <w:r>
-              <w:rPr>
-                <w:rFonts w:ascii="JetBrains Mono" w:eastAsia="JetBrains Mono" w:hAnsi="JetBrains Mono" w:cs="JetBrains Mono"/>
-                <w:color w:val="FFFFFF"/>
-                <w:sz w:val="16"/>
-                <w:szCs w:val="16"/>
-              </w:rPr>
               <w:t>Client gets</w:t>
             </w:r>
           </w:p>
@@ -1556,14 +1501,7 @@
                 <w:sz w:val="18"/>
                 <w:szCs w:val="18"/>
               </w:rPr>
-              <w:t>A validated prototy</w:t>
-            </w:r>
-            <w:r>
-              <w:rPr>
-                <w:sz w:val="18"/>
-                <w:szCs w:val="18"/>
-              </w:rPr>
-              <w:t>pe</w:t>
+              <w:t>A validated prototype</w:t>
             </w:r>
           </w:p>
         </w:tc>
@@ -2028,31 +1966,7 @@
           <w:sz w:val="18"/>
           <w:szCs w:val="18"/>
         </w:rPr>
-        <w:t xml:space="preserve">The loop: Scale feeds back into Learn. What each build teaches goes into the next one. That is "Better with every layer" as a working process. Every cell in this table is </w:t>
-      </w:r>
-      <w:r>
-        <w:rPr>
-          <w:rFonts w:ascii="JetBrains Mono" w:eastAsia="JetBrains Mono" w:hAnsi="JetBrains Mono" w:cs="JetBrains Mono"/>
-          <w:b/>
-          <w:bCs/>
-          <w:i/>
-          <w:iCs/>
-          <w:color w:val="C23A00"/>
-          <w:sz w:val="17"/>
-          <w:szCs w:val="17"/>
-          <w:shd w:val="clear" w:color="auto" w:fill="FFE8E0"/>
-        </w:rPr>
-        <w:t>[CONFIRM]</w:t>
-      </w:r>
-      <w:r>
-        <w:rPr>
-          <w:i/>
-          <w:iCs/>
-          <w:color w:val="5E6166"/>
-          <w:sz w:val="18"/>
-          <w:szCs w:val="18"/>
-        </w:rPr>
-        <w:t xml:space="preserve"> with delivery.</w:t>
+        <w:t xml:space="preserve">The loop: Scale feeds back into Learn. What each build teaches goes into the next one. That is "Better with every layer" as a working process. </w:t>
       </w:r>
     </w:p>
     <w:p>
@@ -2158,10 +2072,7 @@
         <w:spacing w:after="120" w:line="300" w:lineRule="auto"/>
       </w:pPr>
       <w:r>
-        <w:t>The five Strata layers from the brand guidelines become the checklist at the</w:t>
-      </w:r>
-      <w:r>
-        <w:t xml:space="preserve"> Ship Line. Security and compliance run through every layer.</w:t>
+        <w:t>The five Strata layers from the brand guidelines become the checklist at the Ship Line. Security and compliance run through every layer.</w:t>
       </w:r>
     </w:p>
     <w:tbl>
@@ -2245,7 +2156,7 @@
                 <w:sz w:val="16"/>
                 <w:szCs w:val="16"/>
               </w:rPr>
-              <w:t>Checked at the Ship Line [CONFIRM]</w:t>
+              <w:t xml:space="preserve">Checked at the Ship Line </w:t>
             </w:r>
           </w:p>
         </w:tc>
@@ -2588,6 +2499,7 @@
                 <w:sz w:val="18"/>
                 <w:szCs w:val="18"/>
               </w:rPr>
+              <w:lastRenderedPageBreak/>
               <w:t>Through every layer</w:t>
             </w:r>
           </w:p>
@@ -2617,34 +2529,12 @@
                 <w:sz w:val="18"/>
                 <w:szCs w:val="18"/>
               </w:rPr>
-              <w:t>Security and compliance: encryption, least-privilege access,</w:t>
-            </w:r>
-            <w:r>
-              <w:rPr>
-                <w:sz w:val="18"/>
-                <w:szCs w:val="18"/>
-              </w:rPr>
-              <w:t xml:space="preserve"> secure development lifecycle, experience with HIPAA, SOC 2, PCI DSS and GDPR</w:t>
+              <w:t>Security and compliance: encryption, least-privilege access, secure development lifecycle, experience with HIPAA, SOC 2, PCI DSS and GDPR</w:t>
             </w:r>
           </w:p>
         </w:tc>
       </w:tr>
     </w:tbl>
-    <w:p>
-      <w:pPr>
-        <w:spacing w:after="120"/>
-      </w:pPr>
-      <w:r>
-        <w:rPr>
-          <w:i/>
-          <w:iCs/>
-          <w:color w:val="5E6166"/>
-          <w:sz w:val="18"/>
-          <w:szCs w:val="18"/>
-        </w:rPr>
-        <w:t>Only publish what delivery actually does today. A standard that is not followed is a liability.</w:t>
-      </w:r>
-    </w:p>
     <w:p>
       <w:pPr>
         <w:pStyle w:val="Heading1"/>
@@ -2933,14 +2823,7 @@
                 <w:sz w:val="18"/>
                 <w:szCs w:val="18"/>
               </w:rPr>
-              <w:t>The gate document (</w:t>
-            </w:r>
-            <w:r>
-              <w:rPr>
-                <w:sz w:val="18"/>
-                <w:szCs w:val="18"/>
-              </w:rPr>
-              <w:t>brief, decision, prototype)</w:t>
+              <w:t>The gate document (brief, decision, prototype)</w:t>
             </w:r>
           </w:p>
         </w:tc>
@@ -3339,6 +3222,41 @@
     </w:p>
     <w:p>
       <w:pPr>
+        <w:pStyle w:val="Heading1"/>
+        <w:spacing w:before="360" w:after="160"/>
+      </w:pPr>
+      <w:r>
+        <w:rPr>
+          <w:rFonts w:ascii="Funnel Display" w:eastAsia="Funnel Display" w:hAnsi="Funnel Display" w:cs="Funnel Display"/>
+          <w:color w:val="1D1E21"/>
+          <w:sz w:val="36"/>
+          <w:szCs w:val="36"/>
+        </w:rPr>
+        <w:t xml:space="preserve">5. Why it sets </w:t>
+      </w:r>
+      <w:proofErr w:type="spellStart"/>
+      <w:r>
+        <w:rPr>
+          <w:rFonts w:ascii="Funnel Display" w:eastAsia="Funnel Display" w:hAnsi="Funnel Display" w:cs="Funnel Display"/>
+          <w:color w:val="1D1E21"/>
+          <w:sz w:val="36"/>
+          <w:szCs w:val="36"/>
+        </w:rPr>
+        <w:t>TekRevol</w:t>
+      </w:r>
+      <w:proofErr w:type="spellEnd"/>
+      <w:r>
+        <w:rPr>
+          <w:rFonts w:ascii="Funnel Display" w:eastAsia="Funnel Display" w:hAnsi="Funnel Display" w:cs="Funnel Display"/>
+          <w:color w:val="1D1E21"/>
+          <w:sz w:val="36"/>
+          <w:szCs w:val="36"/>
+        </w:rPr>
+        <w:t xml:space="preserve"> apart</w:t>
+      </w:r>
+    </w:p>
+    <w:p>
+      <w:pPr>
         <w:pStyle w:val="ListParagraph"/>
         <w:numPr>
           <w:ilvl w:val="0"/>
@@ -3347,34 +3265,14 @@
         <w:spacing w:after="80" w:line="290" w:lineRule="auto"/>
       </w:pPr>
       <w:r>
-        <w:t xml:space="preserve">The roles above are a starting assumption </w:t>
-      </w:r>
-      <w:r>
         <w:rPr>
-          <w:rFonts w:ascii="JetBrains Mono" w:eastAsia="JetBrains Mono" w:hAnsi="JetBrains Mono" w:cs="JetBrains Mono"/>
           <w:b/>
           <w:bCs/>
-          <w:color w:val="C23A00"/>
-          <w:sz w:val="17"/>
-          <w:szCs w:val="17"/>
-          <w:shd w:val="clear" w:color="auto" w:fill="FFE8E0"/>
         </w:rPr>
-        <w:t>[CONFIRM]</w:t>
-      </w:r>
-    </w:p>
-    <w:p>
-      <w:pPr>
-        <w:pStyle w:val="Heading1"/>
-        <w:spacing w:before="360" w:after="160"/>
-      </w:pPr>
-      <w:r>
-        <w:rPr>
-          <w:rFonts w:ascii="Funnel Display" w:eastAsia="Funnel Display" w:hAnsi="Funnel Display" w:cs="Funnel Display"/>
-          <w:color w:val="1D1E21"/>
-          <w:sz w:val="36"/>
-          <w:szCs w:val="36"/>
-        </w:rPr>
-        <w:t>5. Why it sets TekRevol apart</w:t>
+        <w:t>It names the real problem with AI-built software</w:t>
+      </w:r>
+      <w:r>
+        <w:t xml:space="preserve"> (great demos, fragile products) without blaming anyone. It reframes the prototype story: "You've explored. We help you cross the Ship Line."</w:t>
       </w:r>
     </w:p>
     <w:p>
@@ -3391,10 +3289,10 @@
           <w:b/>
           <w:bCs/>
         </w:rPr>
-        <w:t>It names the real problem with AI-built software</w:t>
-      </w:r>
-      <w:r>
-        <w:t xml:space="preserve"> (great demos, fragile products) without blaming anyone. It reframes the prototype story: "You've explored. We help you cross the Ship Line."</w:t>
+        <w:t>It is visual and ownable.</w:t>
+      </w:r>
+      <w:r>
+        <w:t xml:space="preserve"> Cyan field, orange line, stacked layers. The framework and the brand identity are the same thing</w:t>
       </w:r>
     </w:p>
     <w:p>
@@ -3411,13 +3309,10 @@
           <w:b/>
           <w:bCs/>
         </w:rPr>
-        <w:t>It is visual and ownable.</w:t>
-      </w:r>
-      <w:r>
-        <w:t xml:space="preserve"> Cyan field</w:t>
-      </w:r>
-      <w:r>
-        <w:t>, orange line, stacked layers. The framework and the brand identity are the same thing</w:t>
+        <w:t>It has accountability built in.</w:t>
+      </w:r>
+      <w:r>
+        <w:t xml:space="preserve"> Named owners and written sign-offs the client can see</w:t>
       </w:r>
     </w:p>
     <w:p>
@@ -3434,33 +3329,10 @@
           <w:b/>
           <w:bCs/>
         </w:rPr>
-        <w:t>It has accountability built in.</w:t>
-      </w:r>
-      <w:r>
-        <w:t xml:space="preserve"> Named owners and written sign-offs the client can see</w:t>
-      </w:r>
-    </w:p>
-    <w:p>
-      <w:pPr>
-        <w:pStyle w:val="ListParagraph"/>
-        <w:numPr>
-          <w:ilvl w:val="0"/>
-          <w:numId w:val="2"/>
-        </w:numPr>
-        <w:spacing w:after="80" w:line="290" w:lineRule="auto"/>
-      </w:pPr>
-      <w:r>
-        <w:rPr>
-          <w:b/>
-          <w:bCs/>
-        </w:rPr>
         <w:t>It speaks to every buyer.</w:t>
       </w:r>
       <w:r>
-        <w:t xml:space="preserve"> Founders get speed in Explore, approvers get the Ship Lin</w:t>
-      </w:r>
-      <w:r>
-        <w:t>e, champions get a named method to take to leadership</w:t>
+        <w:t xml:space="preserve"> Founders get speed in Explore, approvers get the Ship Line, champions get a named method to take to leadership</w:t>
       </w:r>
     </w:p>
     <w:p>
@@ -3490,7 +3362,27 @@
           <w:sz w:val="16"/>
           <w:szCs w:val="16"/>
         </w:rPr>
-        <w:t>HOMEPAGE SECTION (REPLACES "HOW WE WORK"): EYEBROW</w:t>
+        <w:t>HOMEPAGE SECTI</w:t>
+      </w:r>
+      <w:r>
+        <w:rPr>
+          <w:rFonts w:ascii="JetBrains Mono" w:eastAsia="JetBrains Mono" w:hAnsi="JetBrains Mono" w:cs="JetBrains Mono"/>
+          <w:color w:val="C23A00"/>
+          <w:spacing w:val="20"/>
+          <w:sz w:val="16"/>
+          <w:szCs w:val="16"/>
+        </w:rPr>
+        <w:t xml:space="preserve">ON: </w:t>
+      </w:r>
+      <w:r>
+        <w:rPr>
+          <w:rFonts w:ascii="JetBrains Mono" w:eastAsia="JetBrains Mono" w:hAnsi="JetBrains Mono" w:cs="JetBrains Mono"/>
+          <w:color w:val="C23A00"/>
+          <w:spacing w:val="20"/>
+          <w:sz w:val="16"/>
+          <w:szCs w:val="16"/>
+        </w:rPr>
+        <w:t>EYEBROW</w:t>
       </w:r>
     </w:p>
     <w:p>
@@ -3506,7 +3398,7 @@
           <w:sz w:val="22"/>
           <w:szCs w:val="22"/>
         </w:rPr>
-        <w:t>THE STRATA METHOD</w:t>
+        <w:t>HOW WE WORK</w:t>
       </w:r>
     </w:p>
     <w:p>
@@ -3538,7 +3430,7 @@
           <w:sz w:val="30"/>
           <w:szCs w:val="30"/>
         </w:rPr>
-        <w:t>Explore fast. Ship deliberately.</w:t>
+        <w:t>The STRATA METHOD</w:t>
       </w:r>
     </w:p>
     <w:p>
@@ -3569,1438 +3461,98 @@
           <w:sz w:val="22"/>
           <w:szCs w:val="22"/>
         </w:rPr>
-        <w:t>AI makes exploring nearly free. Production still takes engineering. Our meth</w:t>
+        <w:lastRenderedPageBreak/>
+        <w:t>AI makes exploring nearly free</w:t>
       </w:r>
       <w:r>
         <w:rPr>
           <w:sz w:val="22"/>
           <w:szCs w:val="22"/>
         </w:rPr>
-        <w:t>od keeps the two apart, with one line between them.</w:t>
+        <w:t>, while p</w:t>
+      </w:r>
+      <w:r>
+        <w:rPr>
+          <w:sz w:val="22"/>
+          <w:szCs w:val="22"/>
+        </w:rPr>
+        <w:t>roduction still takes</w:t>
+      </w:r>
+      <w:r>
+        <w:rPr>
+          <w:sz w:val="22"/>
+          <w:szCs w:val="22"/>
+        </w:rPr>
+        <w:t xml:space="preserve"> some</w:t>
+      </w:r>
+      <w:r>
+        <w:rPr>
+          <w:sz w:val="22"/>
+          <w:szCs w:val="22"/>
+        </w:rPr>
+        <w:t xml:space="preserve"> engineering. Our method keeps the two apart, with one line between them.</w:t>
+      </w:r>
+    </w:p>
+    <w:p/>
+    <w:p>
+      <w:r>
+        <w:drawing>
+          <wp:anchor distT="0" distB="0" distL="114300" distR="114300" simplePos="0" relativeHeight="251658240" behindDoc="0" locked="0" layoutInCell="1" allowOverlap="1" wp14:anchorId="3DFFF860">
+            <wp:simplePos x="0" y="0"/>
+            <wp:positionH relativeFrom="margin">
+              <wp:align>center</wp:align>
+            </wp:positionH>
+            <wp:positionV relativeFrom="paragraph">
+              <wp:posOffset>170864</wp:posOffset>
+            </wp:positionV>
+            <wp:extent cx="6867908" cy="2675990"/>
+            <wp:effectExtent l="0" t="0" r="9525" b="0"/>
+            <wp:wrapSquare wrapText="bothSides"/>
+            <wp:docPr id="1" name="Picture 1"/>
+            <wp:cNvGraphicFramePr>
+              <a:graphicFrameLocks xmlns:a="http://schemas.openxmlformats.org/drawingml/2006/main" noChangeAspect="1"/>
+            </wp:cNvGraphicFramePr>
+            <a:graphic xmlns:a="http://schemas.openxmlformats.org/drawingml/2006/main">
+              <a:graphicData uri="http://schemas.openxmlformats.org/drawingml/2006/picture">
+                <pic:pic xmlns:pic="http://schemas.openxmlformats.org/drawingml/2006/picture">
+                  <pic:nvPicPr>
+                    <pic:cNvPr id="1" name=""/>
+                    <pic:cNvPicPr/>
+                  </pic:nvPicPr>
+                  <pic:blipFill>
+                    <a:blip r:embed="rId7">
+                      <a:extLst>
+                        <a:ext uri="{28A0092B-C50C-407E-A947-70E740481C1C}">
+                          <a14:useLocalDpi xmlns:a14="http://schemas.microsoft.com/office/drawing/2010/main" val="0"/>
+                        </a:ext>
+                      </a:extLst>
+                    </a:blip>
+                    <a:stretch>
+                      <a:fillRect/>
+                    </a:stretch>
+                  </pic:blipFill>
+                  <pic:spPr>
+                    <a:xfrm>
+                      <a:off x="0" y="0"/>
+                      <a:ext cx="6867908" cy="2675990"/>
+                    </a:xfrm>
+                    <a:prstGeom prst="rect">
+                      <a:avLst/>
+                    </a:prstGeom>
+                  </pic:spPr>
+                </pic:pic>
+              </a:graphicData>
+            </a:graphic>
+          </wp:anchor>
+        </w:drawing>
       </w:r>
     </w:p>
     <w:p>
-      <w:pPr>
-        <w:pStyle w:val="ListParagraph"/>
-        <w:numPr>
-          <w:ilvl w:val="0"/>
-          <w:numId w:val="2"/>
-        </w:numPr>
-        <w:spacing w:after="80" w:line="290" w:lineRule="auto"/>
-      </w:pPr>
-      <w:r>
-        <w:t>A dedicated page, /strata-method: definition first, the stage table, the Ship Line checks, FAQs</w:t>
-      </w:r>
+      <w:bookmarkStart w:id="0" w:name="_GoBack"/>
+      <w:bookmarkEnd w:id="0"/>
     </w:p>
-    <w:p>
-      <w:pPr>
-        <w:pStyle w:val="ListParagraph"/>
-        <w:numPr>
-          <w:ilvl w:val="0"/>
-          <w:numId w:val="2"/>
-        </w:numPr>
-        <w:spacing w:after="80" w:line="290" w:lineRule="auto"/>
-      </w:pPr>
-      <w:r>
-        <w:t>The same name and definition sentence on the homepage, the method page, llms.txt, About, proposals and Linke</w:t>
-      </w:r>
-      <w:r>
-        <w:t>dIn, so search and AI engines learn one consistent answer</w:t>
-      </w:r>
-    </w:p>
-    <w:p>
-      <w:pPr>
-        <w:pStyle w:val="ListParagraph"/>
-        <w:numPr>
-          <w:ilvl w:val="0"/>
-          <w:numId w:val="2"/>
-        </w:numPr>
-        <w:spacing w:after="80" w:line="290" w:lineRule="auto"/>
-      </w:pPr>
-      <w:r>
-        <w:t>Later: a short manifesto PDF for champions and one blog post per stage</w:t>
-      </w:r>
-    </w:p>
-    <w:p>
-      <w:pPr>
-        <w:pStyle w:val="ListParagraph"/>
-        <w:numPr>
-          <w:ilvl w:val="0"/>
-          <w:numId w:val="2"/>
-        </w:numPr>
-        <w:spacing w:after="80" w:line="290" w:lineRule="auto"/>
-      </w:pPr>
-      <w:r>
-        <w:t>No speed or cost claims until one measured engagement exists</w:t>
-      </w:r>
-    </w:p>
-    <w:p>
-      <w:r>
-        <w:br w:type="page"/>
-      </w:r>
-    </w:p>
-    <w:p>
-      <w:pPr>
-        <w:pStyle w:val="Heading1"/>
-        <w:spacing w:before="360" w:after="160"/>
-      </w:pPr>
-      <w:r>
-        <w:rPr>
-          <w:rFonts w:ascii="Funnel Display" w:eastAsia="Funnel Display" w:hAnsi="Funnel Display" w:cs="Funnel Display"/>
-          <w:color w:val="1D1E21"/>
-          <w:sz w:val="36"/>
-          <w:szCs w:val="36"/>
-        </w:rPr>
-        <w:t>6. Questions for project managers and the CTO</w:t>
-      </w:r>
-    </w:p>
-    <w:p>
-      <w:pPr>
-        <w:spacing w:after="120" w:line="300" w:lineRule="auto"/>
-      </w:pPr>
-      <w:r>
-        <w:t>Short answers are fine. "It depends on the project" is a valid answer: tell us what it depends on.</w:t>
-      </w:r>
-    </w:p>
-    <w:p>
-      <w:pPr>
-        <w:pStyle w:val="Heading2"/>
-        <w:spacing w:before="280" w:after="100"/>
-      </w:pPr>
-      <w:r>
-        <w:rPr>
-          <w:rFonts w:ascii="Funnel Display" w:eastAsia="Funnel Display" w:hAnsi="Funnel Display" w:cs="Funnel Display"/>
-          <w:color w:val="1D1E21"/>
-          <w:sz w:val="28"/>
-          <w:szCs w:val="28"/>
-        </w:rPr>
-        <w:t>How projects run today</w:t>
-      </w:r>
-    </w:p>
-    <w:p>
-      <w:pPr>
-        <w:pStyle w:val="ListParagraph"/>
-        <w:numPr>
-          <w:ilvl w:val="0"/>
-          <w:numId w:val="3"/>
-        </w:numPr>
-        <w:spacing w:after="80" w:line="290" w:lineRule="auto"/>
-      </w:pPr>
-      <w:r>
-        <w:t>Walk us through the last two projects from kickoff to launch. What were the real phases, and what document or sign-off ended each one?</w:t>
-      </w:r>
-    </w:p>
-    <w:p>
-      <w:pPr>
-        <w:pStyle w:val="ListParagraph"/>
-        <w:numPr>
-          <w:ilvl w:val="0"/>
-          <w:numId w:val="3"/>
-        </w:numPr>
-        <w:spacing w:after="80" w:line="290" w:lineRule="auto"/>
-      </w:pPr>
-      <w:r>
-        <w:t>Who decides a build is ready for production today? Is it written down?</w:t>
-      </w:r>
-    </w:p>
-    <w:p>
-      <w:pPr>
-        <w:pStyle w:val="ListParagraph"/>
-        <w:numPr>
-          <w:ilvl w:val="0"/>
-          <w:numId w:val="3"/>
-        </w:numPr>
-        <w:spacing w:after="80" w:line="290" w:lineRule="auto"/>
-      </w:pPr>
-      <w:r>
-        <w:t>Is there one point of contact from kickoff to launch? Who?</w:t>
-      </w:r>
-    </w:p>
-    <w:p>
-      <w:pPr>
-        <w:pStyle w:val="ListParagraph"/>
-        <w:numPr>
-          <w:ilvl w:val="0"/>
-          <w:numId w:val="3"/>
-        </w:numPr>
-        <w:spacing w:after="80" w:line="290" w:lineRule="auto"/>
-      </w:pPr>
-      <w:r>
-        <w:t>Where do projects most often slip or get reworked?</w:t>
-      </w:r>
-    </w:p>
-    <w:p>
-      <w:pPr>
-        <w:pStyle w:val="Heading2"/>
-        <w:spacing w:before="280" w:after="100"/>
-      </w:pPr>
-      <w:r>
-        <w:rPr>
-          <w:rFonts w:ascii="Funnel Display" w:eastAsia="Funnel Display" w:hAnsi="Funnel Display" w:cs="Funnel Display"/>
-          <w:color w:val="1D1E21"/>
-          <w:sz w:val="28"/>
-          <w:szCs w:val="28"/>
-        </w:rPr>
-        <w:t>AI in delivery</w:t>
-      </w:r>
-    </w:p>
-    <w:p>
-      <w:pPr>
-        <w:pStyle w:val="ListParagraph"/>
-        <w:numPr>
-          <w:ilvl w:val="0"/>
-          <w:numId w:val="3"/>
-        </w:numPr>
-        <w:spacing w:after="80" w:line="290" w:lineRule="auto"/>
-      </w:pPr>
-      <w:r>
-        <w:t>Which AI tools does the team use today, and for what: resea</w:t>
-      </w:r>
-      <w:r>
-        <w:t>rch, prototyping, writing code, code review, testing, documentation, monitoring?</w:t>
-      </w:r>
-    </w:p>
-    <w:p>
-      <w:pPr>
-        <w:pStyle w:val="ListParagraph"/>
-        <w:numPr>
-          <w:ilvl w:val="0"/>
-          <w:numId w:val="3"/>
-        </w:numPr>
-        <w:spacing w:after="80" w:line="290" w:lineRule="auto"/>
-      </w:pPr>
-      <w:r>
-        <w:t>Is that standard across projects or each developer's choice? Is there an approved-tools list or policy?</w:t>
-      </w:r>
-    </w:p>
-    <w:p>
-      <w:pPr>
-        <w:pStyle w:val="ListParagraph"/>
-        <w:numPr>
-          <w:ilvl w:val="0"/>
-          <w:numId w:val="3"/>
-        </w:numPr>
-        <w:spacing w:after="80" w:line="290" w:lineRule="auto"/>
-      </w:pPr>
-      <w:r>
-        <w:t>Does client code or data go into third-party AI tools? Under what rules</w:t>
-      </w:r>
-      <w:r>
-        <w:t xml:space="preserve"> (private models, client consent, regulated projects)?</w:t>
-      </w:r>
-    </w:p>
-    <w:p>
-      <w:pPr>
-        <w:pStyle w:val="ListParagraph"/>
-        <w:numPr>
-          <w:ilvl w:val="0"/>
-          <w:numId w:val="3"/>
-        </w:numPr>
-        <w:spacing w:after="80" w:line="290" w:lineRule="auto"/>
-      </w:pPr>
-      <w:r>
-        <w:t>Is every AI-written change reviewed by a person before it is merged? By whom?</w:t>
-      </w:r>
-    </w:p>
-    <w:p>
-      <w:pPr>
-        <w:pStyle w:val="ListParagraph"/>
-        <w:numPr>
-          <w:ilvl w:val="0"/>
-          <w:numId w:val="3"/>
-        </w:numPr>
-        <w:spacing w:after="80" w:line="290" w:lineRule="auto"/>
-      </w:pPr>
-      <w:r>
-        <w:t>For AI features built for clients: how is model quality tested before launch and monitored after?</w:t>
-      </w:r>
-    </w:p>
-    <w:p>
-      <w:pPr>
-        <w:pStyle w:val="Heading2"/>
-        <w:spacing w:before="280" w:after="100"/>
-      </w:pPr>
-      <w:r>
-        <w:rPr>
-          <w:rFonts w:ascii="Funnel Display" w:eastAsia="Funnel Display" w:hAnsi="Funnel Display" w:cs="Funnel Display"/>
-          <w:color w:val="1D1E21"/>
-          <w:sz w:val="28"/>
-          <w:szCs w:val="28"/>
-        </w:rPr>
-        <w:t>Standards and proof</w:t>
-      </w:r>
-    </w:p>
-    <w:p>
-      <w:pPr>
-        <w:pStyle w:val="ListParagraph"/>
-        <w:numPr>
-          <w:ilvl w:val="0"/>
-          <w:numId w:val="3"/>
-        </w:numPr>
-        <w:spacing w:after="80" w:line="290" w:lineRule="auto"/>
-      </w:pPr>
-      <w:r>
-        <w:t xml:space="preserve">What </w:t>
-      </w:r>
-      <w:r>
-        <w:t>is checked before go-live today (security, tests, accessibility, backups, monitoring)? Is there a checklist?</w:t>
-      </w:r>
-    </w:p>
-    <w:p>
-      <w:pPr>
-        <w:pStyle w:val="ListParagraph"/>
-        <w:numPr>
-          <w:ilvl w:val="0"/>
-          <w:numId w:val="3"/>
-        </w:numPr>
-        <w:spacing w:after="80" w:line="290" w:lineRule="auto"/>
-      </w:pPr>
-      <w:r>
-        <w:t>What gets reused across projects (components, templates, internal agents, checklists)? Where does it live?</w:t>
-      </w:r>
-    </w:p>
-    <w:p>
-      <w:pPr>
-        <w:pStyle w:val="ListParagraph"/>
-        <w:numPr>
-          <w:ilvl w:val="0"/>
-          <w:numId w:val="3"/>
-        </w:numPr>
-        <w:spacing w:after="80" w:line="290" w:lineRule="auto"/>
-      </w:pPr>
-      <w:r>
-        <w:t>Is there one recent project where time o</w:t>
-      </w:r>
-      <w:r>
-        <w:t>r cost can be measured with and without AI? That would be the first proof point.</w:t>
-      </w:r>
-    </w:p>
-    <w:p>
-      <w:pPr>
-        <w:pStyle w:val="ListParagraph"/>
-        <w:numPr>
-          <w:ilvl w:val="0"/>
-          <w:numId w:val="3"/>
-        </w:numPr>
-        <w:spacing w:after="80" w:line="290" w:lineRule="auto"/>
-      </w:pPr>
-      <w:r>
-        <w:t>Which stages and the Ship Line could the team commit to from a set date, and who would own the gate log?</w:t>
-      </w:r>
-    </w:p>
-    <w:p>
-      <w:pPr>
-        <w:pStyle w:val="Heading2"/>
-        <w:spacing w:before="280" w:after="100"/>
-      </w:pPr>
-      <w:r>
-        <w:rPr>
-          <w:rFonts w:ascii="Funnel Display" w:eastAsia="Funnel Display" w:hAnsi="Funnel Display" w:cs="Funnel Display"/>
-          <w:color w:val="1D1E21"/>
-          <w:sz w:val="28"/>
-          <w:szCs w:val="28"/>
-        </w:rPr>
-        <w:t>Answers</w:t>
-      </w:r>
-    </w:p>
-    <w:tbl>
-      <w:tblPr>
-        <w:tblW w:w="9360" w:type="dxa"/>
-        <w:tblBorders>
-          <w:top w:val="single" w:sz="4" w:space="0" w:color="auto"/>
-          <w:left w:val="single" w:sz="4" w:space="0" w:color="auto"/>
-          <w:bottom w:val="single" w:sz="4" w:space="0" w:color="auto"/>
-          <w:right w:val="single" w:sz="4" w:space="0" w:color="auto"/>
-          <w:insideH w:val="single" w:sz="4" w:space="0" w:color="auto"/>
-          <w:insideV w:val="single" w:sz="4" w:space="0" w:color="auto"/>
-        </w:tblBorders>
-        <w:tblLook w:val="04A0" w:firstRow="1" w:lastRow="0" w:firstColumn="1" w:lastColumn="0" w:noHBand="0" w:noVBand="1"/>
-      </w:tblPr>
-      <w:tblGrid>
-        <w:gridCol w:w="600"/>
-        <w:gridCol w:w="6760"/>
-        <w:gridCol w:w="2000"/>
-      </w:tblGrid>
-      <w:tr>
-        <w:trPr>
-          <w:tblHeader/>
-        </w:trPr>
-        <w:tc>
-          <w:tcPr>
-            <w:tcW w:w="600" w:type="dxa"/>
-            <w:tcBorders>
-              <w:top w:val="single" w:sz="4" w:space="0" w:color="C9CCCF"/>
-              <w:left w:val="single" w:sz="4" w:space="0" w:color="C9CCCF"/>
-              <w:bottom w:val="single" w:sz="4" w:space="0" w:color="C9CCCF"/>
-              <w:right w:val="single" w:sz="4" w:space="0" w:color="C9CCCF"/>
-            </w:tcBorders>
-            <w:shd w:val="clear" w:color="auto" w:fill="1D1E21"/>
-            <w:tcMar>
-              <w:top w:w="80" w:type="dxa"/>
-              <w:left w:w="110" w:type="dxa"/>
-              <w:bottom w:w="80" w:type="dxa"/>
-              <w:right w:w="110" w:type="dxa"/>
-            </w:tcMar>
-          </w:tcPr>
-          <w:p>
-            <w:pPr>
-              <w:spacing w:line="270" w:lineRule="auto"/>
-            </w:pPr>
-            <w:r>
-              <w:rPr>
-                <w:rFonts w:ascii="JetBrains Mono" w:eastAsia="JetBrains Mono" w:hAnsi="JetBrains Mono" w:cs="JetBrains Mono"/>
-                <w:color w:val="FFFFFF"/>
-                <w:sz w:val="16"/>
-                <w:szCs w:val="16"/>
-              </w:rPr>
-              <w:t>#</w:t>
-            </w:r>
-          </w:p>
-        </w:tc>
-        <w:tc>
-          <w:tcPr>
-            <w:tcW w:w="6760" w:type="dxa"/>
-            <w:tcBorders>
-              <w:top w:val="single" w:sz="4" w:space="0" w:color="C9CCCF"/>
-              <w:left w:val="single" w:sz="4" w:space="0" w:color="C9CCCF"/>
-              <w:bottom w:val="single" w:sz="4" w:space="0" w:color="C9CCCF"/>
-              <w:right w:val="single" w:sz="4" w:space="0" w:color="C9CCCF"/>
-            </w:tcBorders>
-            <w:shd w:val="clear" w:color="auto" w:fill="1D1E21"/>
-            <w:tcMar>
-              <w:top w:w="80" w:type="dxa"/>
-              <w:left w:w="110" w:type="dxa"/>
-              <w:bottom w:w="80" w:type="dxa"/>
-              <w:right w:w="110" w:type="dxa"/>
-            </w:tcMar>
-          </w:tcPr>
-          <w:p>
-            <w:pPr>
-              <w:spacing w:line="270" w:lineRule="auto"/>
-            </w:pPr>
-            <w:r>
-              <w:rPr>
-                <w:rFonts w:ascii="JetBrains Mono" w:eastAsia="JetBrains Mono" w:hAnsi="JetBrains Mono" w:cs="JetBrains Mono"/>
-                <w:color w:val="FFFFFF"/>
-                <w:sz w:val="16"/>
-                <w:szCs w:val="16"/>
-              </w:rPr>
-              <w:t>Answer</w:t>
-            </w:r>
-          </w:p>
-        </w:tc>
-        <w:tc>
-          <w:tcPr>
-            <w:tcW w:w="2000" w:type="dxa"/>
-            <w:tcBorders>
-              <w:top w:val="single" w:sz="4" w:space="0" w:color="C9CCCF"/>
-              <w:left w:val="single" w:sz="4" w:space="0" w:color="C9CCCF"/>
-              <w:bottom w:val="single" w:sz="4" w:space="0" w:color="C9CCCF"/>
-              <w:right w:val="single" w:sz="4" w:space="0" w:color="C9CCCF"/>
-            </w:tcBorders>
-            <w:shd w:val="clear" w:color="auto" w:fill="1D1E21"/>
-            <w:tcMar>
-              <w:top w:w="80" w:type="dxa"/>
-              <w:left w:w="110" w:type="dxa"/>
-              <w:bottom w:w="80" w:type="dxa"/>
-              <w:right w:w="110" w:type="dxa"/>
-            </w:tcMar>
-          </w:tcPr>
-          <w:p>
-            <w:pPr>
-              <w:spacing w:line="270" w:lineRule="auto"/>
-            </w:pPr>
-            <w:r>
-              <w:rPr>
-                <w:rFonts w:ascii="JetBrains Mono" w:eastAsia="JetBrains Mono" w:hAnsi="JetBrains Mono" w:cs="JetBrains Mono"/>
-                <w:color w:val="FFFFFF"/>
-                <w:sz w:val="16"/>
-                <w:szCs w:val="16"/>
-              </w:rPr>
-              <w:t>Answered by</w:t>
-            </w:r>
-          </w:p>
-        </w:tc>
-      </w:tr>
-      <w:tr>
-        <w:tc>
-          <w:tcPr>
-            <w:tcW w:w="600" w:type="dxa"/>
-            <w:tcBorders>
-              <w:top w:val="single" w:sz="4" w:space="0" w:color="C9CCCF"/>
-              <w:left w:val="single" w:sz="4" w:space="0" w:color="C9CCCF"/>
-              <w:bottom w:val="single" w:sz="4" w:space="0" w:color="C9CCCF"/>
-              <w:right w:val="single" w:sz="4" w:space="0" w:color="C9CCCF"/>
-            </w:tcBorders>
-            <w:tcMar>
-              <w:top w:w="80" w:type="dxa"/>
-              <w:left w:w="110" w:type="dxa"/>
-              <w:bottom w:w="80" w:type="dxa"/>
-              <w:right w:w="110" w:type="dxa"/>
-            </w:tcMar>
-          </w:tcPr>
-          <w:p>
-            <w:pPr>
-              <w:spacing w:line="270" w:lineRule="auto"/>
-            </w:pPr>
-            <w:r>
-              <w:rPr>
-                <w:sz w:val="18"/>
-                <w:szCs w:val="18"/>
-              </w:rPr>
-              <w:t>1</w:t>
-            </w:r>
-          </w:p>
-        </w:tc>
-        <w:tc>
-          <w:tcPr>
-            <w:tcW w:w="6760" w:type="dxa"/>
-            <w:tcBorders>
-              <w:top w:val="single" w:sz="4" w:space="0" w:color="C9CCCF"/>
-              <w:left w:val="single" w:sz="4" w:space="0" w:color="C9CCCF"/>
-              <w:bottom w:val="single" w:sz="4" w:space="0" w:color="C9CCCF"/>
-              <w:right w:val="single" w:sz="4" w:space="0" w:color="C9CCCF"/>
-            </w:tcBorders>
-            <w:tcMar>
-              <w:top w:w="80" w:type="dxa"/>
-              <w:left w:w="110" w:type="dxa"/>
-              <w:bottom w:w="80" w:type="dxa"/>
-              <w:right w:w="110" w:type="dxa"/>
-            </w:tcMar>
-          </w:tcPr>
-          <w:p>
-            <w:pPr>
-              <w:spacing w:line="270" w:lineRule="auto"/>
-            </w:pPr>
-          </w:p>
-        </w:tc>
-        <w:tc>
-          <w:tcPr>
-            <w:tcW w:w="2000" w:type="dxa"/>
-            <w:tcBorders>
-              <w:top w:val="single" w:sz="4" w:space="0" w:color="C9CCCF"/>
-              <w:left w:val="single" w:sz="4" w:space="0" w:color="C9CCCF"/>
-              <w:bottom w:val="single" w:sz="4" w:space="0" w:color="C9CCCF"/>
-              <w:right w:val="single" w:sz="4" w:space="0" w:color="C9CCCF"/>
-            </w:tcBorders>
-            <w:tcMar>
-              <w:top w:w="80" w:type="dxa"/>
-              <w:left w:w="110" w:type="dxa"/>
-              <w:bottom w:w="80" w:type="dxa"/>
-              <w:right w:w="110" w:type="dxa"/>
-            </w:tcMar>
-          </w:tcPr>
-          <w:p>
-            <w:pPr>
-              <w:spacing w:line="270" w:lineRule="auto"/>
-            </w:pPr>
-          </w:p>
-        </w:tc>
-      </w:tr>
-      <w:tr>
-        <w:tc>
-          <w:tcPr>
-            <w:tcW w:w="600" w:type="dxa"/>
-            <w:tcBorders>
-              <w:top w:val="single" w:sz="4" w:space="0" w:color="C9CCCF"/>
-              <w:left w:val="single" w:sz="4" w:space="0" w:color="C9CCCF"/>
-              <w:bottom w:val="single" w:sz="4" w:space="0" w:color="C9CCCF"/>
-              <w:right w:val="single" w:sz="4" w:space="0" w:color="C9CCCF"/>
-            </w:tcBorders>
-            <w:tcMar>
-              <w:top w:w="80" w:type="dxa"/>
-              <w:left w:w="110" w:type="dxa"/>
-              <w:bottom w:w="80" w:type="dxa"/>
-              <w:right w:w="110" w:type="dxa"/>
-            </w:tcMar>
-          </w:tcPr>
-          <w:p>
-            <w:pPr>
-              <w:spacing w:line="270" w:lineRule="auto"/>
-            </w:pPr>
-            <w:r>
-              <w:rPr>
-                <w:sz w:val="18"/>
-                <w:szCs w:val="18"/>
-              </w:rPr>
-              <w:t>2</w:t>
-            </w:r>
-          </w:p>
-        </w:tc>
-        <w:tc>
-          <w:tcPr>
-            <w:tcW w:w="6760" w:type="dxa"/>
-            <w:tcBorders>
-              <w:top w:val="single" w:sz="4" w:space="0" w:color="C9CCCF"/>
-              <w:left w:val="single" w:sz="4" w:space="0" w:color="C9CCCF"/>
-              <w:bottom w:val="single" w:sz="4" w:space="0" w:color="C9CCCF"/>
-              <w:right w:val="single" w:sz="4" w:space="0" w:color="C9CCCF"/>
-            </w:tcBorders>
-            <w:tcMar>
-              <w:top w:w="80" w:type="dxa"/>
-              <w:left w:w="110" w:type="dxa"/>
-              <w:bottom w:w="80" w:type="dxa"/>
-              <w:right w:w="110" w:type="dxa"/>
-            </w:tcMar>
-          </w:tcPr>
-          <w:p>
-            <w:pPr>
-              <w:spacing w:line="270" w:lineRule="auto"/>
-            </w:pPr>
-          </w:p>
-        </w:tc>
-        <w:tc>
-          <w:tcPr>
-            <w:tcW w:w="2000" w:type="dxa"/>
-            <w:tcBorders>
-              <w:top w:val="single" w:sz="4" w:space="0" w:color="C9CCCF"/>
-              <w:left w:val="single" w:sz="4" w:space="0" w:color="C9CCCF"/>
-              <w:bottom w:val="single" w:sz="4" w:space="0" w:color="C9CCCF"/>
-              <w:right w:val="single" w:sz="4" w:space="0" w:color="C9CCCF"/>
-            </w:tcBorders>
-            <w:tcMar>
-              <w:top w:w="80" w:type="dxa"/>
-              <w:left w:w="110" w:type="dxa"/>
-              <w:bottom w:w="80" w:type="dxa"/>
-              <w:right w:w="110" w:type="dxa"/>
-            </w:tcMar>
-          </w:tcPr>
-          <w:p>
-            <w:pPr>
-              <w:spacing w:line="270" w:lineRule="auto"/>
-            </w:pPr>
-          </w:p>
-        </w:tc>
-      </w:tr>
-      <w:tr>
-        <w:tc>
-          <w:tcPr>
-            <w:tcW w:w="600" w:type="dxa"/>
-            <w:tcBorders>
-              <w:top w:val="single" w:sz="4" w:space="0" w:color="C9CCCF"/>
-              <w:left w:val="single" w:sz="4" w:space="0" w:color="C9CCCF"/>
-              <w:bottom w:val="single" w:sz="4" w:space="0" w:color="C9CCCF"/>
-              <w:right w:val="single" w:sz="4" w:space="0" w:color="C9CCCF"/>
-            </w:tcBorders>
-            <w:tcMar>
-              <w:top w:w="80" w:type="dxa"/>
-              <w:left w:w="110" w:type="dxa"/>
-              <w:bottom w:w="80" w:type="dxa"/>
-              <w:right w:w="110" w:type="dxa"/>
-            </w:tcMar>
-          </w:tcPr>
-          <w:p>
-            <w:pPr>
-              <w:spacing w:line="270" w:lineRule="auto"/>
-            </w:pPr>
-            <w:r>
-              <w:rPr>
-                <w:sz w:val="18"/>
-                <w:szCs w:val="18"/>
-              </w:rPr>
-              <w:t>3</w:t>
-            </w:r>
-          </w:p>
-        </w:tc>
-        <w:tc>
-          <w:tcPr>
-            <w:tcW w:w="6760" w:type="dxa"/>
-            <w:tcBorders>
-              <w:top w:val="single" w:sz="4" w:space="0" w:color="C9CCCF"/>
-              <w:left w:val="single" w:sz="4" w:space="0" w:color="C9CCCF"/>
-              <w:bottom w:val="single" w:sz="4" w:space="0" w:color="C9CCCF"/>
-              <w:right w:val="single" w:sz="4" w:space="0" w:color="C9CCCF"/>
-            </w:tcBorders>
-            <w:tcMar>
-              <w:top w:w="80" w:type="dxa"/>
-              <w:left w:w="110" w:type="dxa"/>
-              <w:bottom w:w="80" w:type="dxa"/>
-              <w:right w:w="110" w:type="dxa"/>
-            </w:tcMar>
-          </w:tcPr>
-          <w:p>
-            <w:pPr>
-              <w:spacing w:line="270" w:lineRule="auto"/>
-            </w:pPr>
-          </w:p>
-        </w:tc>
-        <w:tc>
-          <w:tcPr>
-            <w:tcW w:w="2000" w:type="dxa"/>
-            <w:tcBorders>
-              <w:top w:val="single" w:sz="4" w:space="0" w:color="C9CCCF"/>
-              <w:left w:val="single" w:sz="4" w:space="0" w:color="C9CCCF"/>
-              <w:bottom w:val="single" w:sz="4" w:space="0" w:color="C9CCCF"/>
-              <w:right w:val="single" w:sz="4" w:space="0" w:color="C9CCCF"/>
-            </w:tcBorders>
-            <w:tcMar>
-              <w:top w:w="80" w:type="dxa"/>
-              <w:left w:w="110" w:type="dxa"/>
-              <w:bottom w:w="80" w:type="dxa"/>
-              <w:right w:w="110" w:type="dxa"/>
-            </w:tcMar>
-          </w:tcPr>
-          <w:p>
-            <w:pPr>
-              <w:spacing w:line="270" w:lineRule="auto"/>
-            </w:pPr>
-          </w:p>
-        </w:tc>
-      </w:tr>
-      <w:tr>
-        <w:tc>
-          <w:tcPr>
-            <w:tcW w:w="600" w:type="dxa"/>
-            <w:tcBorders>
-              <w:top w:val="single" w:sz="4" w:space="0" w:color="C9CCCF"/>
-              <w:left w:val="single" w:sz="4" w:space="0" w:color="C9CCCF"/>
-              <w:bottom w:val="single" w:sz="4" w:space="0" w:color="C9CCCF"/>
-              <w:right w:val="single" w:sz="4" w:space="0" w:color="C9CCCF"/>
-            </w:tcBorders>
-            <w:tcMar>
-              <w:top w:w="80" w:type="dxa"/>
-              <w:left w:w="110" w:type="dxa"/>
-              <w:bottom w:w="80" w:type="dxa"/>
-              <w:right w:w="110" w:type="dxa"/>
-            </w:tcMar>
-          </w:tcPr>
-          <w:p>
-            <w:pPr>
-              <w:spacing w:line="270" w:lineRule="auto"/>
-            </w:pPr>
-            <w:r>
-              <w:rPr>
-                <w:sz w:val="18"/>
-                <w:szCs w:val="18"/>
-              </w:rPr>
-              <w:t>4</w:t>
-            </w:r>
-          </w:p>
-        </w:tc>
-        <w:tc>
-          <w:tcPr>
-            <w:tcW w:w="6760" w:type="dxa"/>
-            <w:tcBorders>
-              <w:top w:val="single" w:sz="4" w:space="0" w:color="C9CCCF"/>
-              <w:left w:val="single" w:sz="4" w:space="0" w:color="C9CCCF"/>
-              <w:bottom w:val="single" w:sz="4" w:space="0" w:color="C9CCCF"/>
-              <w:right w:val="single" w:sz="4" w:space="0" w:color="C9CCCF"/>
-            </w:tcBorders>
-            <w:tcMar>
-              <w:top w:w="80" w:type="dxa"/>
-              <w:left w:w="110" w:type="dxa"/>
-              <w:bottom w:w="80" w:type="dxa"/>
-              <w:right w:w="110" w:type="dxa"/>
-            </w:tcMar>
-          </w:tcPr>
-          <w:p>
-            <w:pPr>
-              <w:spacing w:line="270" w:lineRule="auto"/>
-            </w:pPr>
-          </w:p>
-        </w:tc>
-        <w:tc>
-          <w:tcPr>
-            <w:tcW w:w="2000" w:type="dxa"/>
-            <w:tcBorders>
-              <w:top w:val="single" w:sz="4" w:space="0" w:color="C9CCCF"/>
-              <w:left w:val="single" w:sz="4" w:space="0" w:color="C9CCCF"/>
-              <w:bottom w:val="single" w:sz="4" w:space="0" w:color="C9CCCF"/>
-              <w:right w:val="single" w:sz="4" w:space="0" w:color="C9CCCF"/>
-            </w:tcBorders>
-            <w:tcMar>
-              <w:top w:w="80" w:type="dxa"/>
-              <w:left w:w="110" w:type="dxa"/>
-              <w:bottom w:w="80" w:type="dxa"/>
-              <w:right w:w="110" w:type="dxa"/>
-            </w:tcMar>
-          </w:tcPr>
-          <w:p>
-            <w:pPr>
-              <w:spacing w:line="270" w:lineRule="auto"/>
-            </w:pPr>
-          </w:p>
-        </w:tc>
-      </w:tr>
-      <w:tr>
-        <w:tc>
-          <w:tcPr>
-            <w:tcW w:w="600" w:type="dxa"/>
-            <w:tcBorders>
-              <w:top w:val="single" w:sz="4" w:space="0" w:color="C9CCCF"/>
-              <w:left w:val="single" w:sz="4" w:space="0" w:color="C9CCCF"/>
-              <w:bottom w:val="single" w:sz="4" w:space="0" w:color="C9CCCF"/>
-              <w:right w:val="single" w:sz="4" w:space="0" w:color="C9CCCF"/>
-            </w:tcBorders>
-            <w:tcMar>
-              <w:top w:w="80" w:type="dxa"/>
-              <w:left w:w="110" w:type="dxa"/>
-              <w:bottom w:w="80" w:type="dxa"/>
-              <w:right w:w="110" w:type="dxa"/>
-            </w:tcMar>
-          </w:tcPr>
-          <w:p>
-            <w:pPr>
-              <w:spacing w:line="270" w:lineRule="auto"/>
-            </w:pPr>
-            <w:r>
-              <w:rPr>
-                <w:sz w:val="18"/>
-                <w:szCs w:val="18"/>
-              </w:rPr>
-              <w:t>5</w:t>
-            </w:r>
-          </w:p>
-        </w:tc>
-        <w:tc>
-          <w:tcPr>
-            <w:tcW w:w="6760" w:type="dxa"/>
-            <w:tcBorders>
-              <w:top w:val="single" w:sz="4" w:space="0" w:color="C9CCCF"/>
-              <w:left w:val="single" w:sz="4" w:space="0" w:color="C9CCCF"/>
-              <w:bottom w:val="single" w:sz="4" w:space="0" w:color="C9CCCF"/>
-              <w:right w:val="single" w:sz="4" w:space="0" w:color="C9CCCF"/>
-            </w:tcBorders>
-            <w:tcMar>
-              <w:top w:w="80" w:type="dxa"/>
-              <w:left w:w="110" w:type="dxa"/>
-              <w:bottom w:w="80" w:type="dxa"/>
-              <w:right w:w="110" w:type="dxa"/>
-            </w:tcMar>
-          </w:tcPr>
-          <w:p>
-            <w:pPr>
-              <w:spacing w:line="270" w:lineRule="auto"/>
-            </w:pPr>
-          </w:p>
-        </w:tc>
-        <w:tc>
-          <w:tcPr>
-            <w:tcW w:w="2000" w:type="dxa"/>
-            <w:tcBorders>
-              <w:top w:val="single" w:sz="4" w:space="0" w:color="C9CCCF"/>
-              <w:left w:val="single" w:sz="4" w:space="0" w:color="C9CCCF"/>
-              <w:bottom w:val="single" w:sz="4" w:space="0" w:color="C9CCCF"/>
-              <w:right w:val="single" w:sz="4" w:space="0" w:color="C9CCCF"/>
-            </w:tcBorders>
-            <w:tcMar>
-              <w:top w:w="80" w:type="dxa"/>
-              <w:left w:w="110" w:type="dxa"/>
-              <w:bottom w:w="80" w:type="dxa"/>
-              <w:right w:w="110" w:type="dxa"/>
-            </w:tcMar>
-          </w:tcPr>
-          <w:p>
-            <w:pPr>
-              <w:spacing w:line="270" w:lineRule="auto"/>
-            </w:pPr>
-          </w:p>
-        </w:tc>
-      </w:tr>
-      <w:tr>
-        <w:tc>
-          <w:tcPr>
-            <w:tcW w:w="600" w:type="dxa"/>
-            <w:tcBorders>
-              <w:top w:val="single" w:sz="4" w:space="0" w:color="C9CCCF"/>
-              <w:left w:val="single" w:sz="4" w:space="0" w:color="C9CCCF"/>
-              <w:bottom w:val="single" w:sz="4" w:space="0" w:color="C9CCCF"/>
-              <w:right w:val="single" w:sz="4" w:space="0" w:color="C9CCCF"/>
-            </w:tcBorders>
-            <w:tcMar>
-              <w:top w:w="80" w:type="dxa"/>
-              <w:left w:w="110" w:type="dxa"/>
-              <w:bottom w:w="80" w:type="dxa"/>
-              <w:right w:w="110" w:type="dxa"/>
-            </w:tcMar>
-          </w:tcPr>
-          <w:p>
-            <w:pPr>
-              <w:spacing w:line="270" w:lineRule="auto"/>
-            </w:pPr>
-            <w:r>
-              <w:rPr>
-                <w:sz w:val="18"/>
-                <w:szCs w:val="18"/>
-              </w:rPr>
-              <w:t>6</w:t>
-            </w:r>
-          </w:p>
-        </w:tc>
-        <w:tc>
-          <w:tcPr>
-            <w:tcW w:w="6760" w:type="dxa"/>
-            <w:tcBorders>
-              <w:top w:val="single" w:sz="4" w:space="0" w:color="C9CCCF"/>
-              <w:left w:val="single" w:sz="4" w:space="0" w:color="C9CCCF"/>
-              <w:bottom w:val="single" w:sz="4" w:space="0" w:color="C9CCCF"/>
-              <w:right w:val="single" w:sz="4" w:space="0" w:color="C9CCCF"/>
-            </w:tcBorders>
-            <w:tcMar>
-              <w:top w:w="80" w:type="dxa"/>
-              <w:left w:w="110" w:type="dxa"/>
-              <w:bottom w:w="80" w:type="dxa"/>
-              <w:right w:w="110" w:type="dxa"/>
-            </w:tcMar>
-          </w:tcPr>
-          <w:p>
-            <w:pPr>
-              <w:spacing w:line="270" w:lineRule="auto"/>
-            </w:pPr>
-          </w:p>
-        </w:tc>
-        <w:tc>
-          <w:tcPr>
-            <w:tcW w:w="2000" w:type="dxa"/>
-            <w:tcBorders>
-              <w:top w:val="single" w:sz="4" w:space="0" w:color="C9CCCF"/>
-              <w:left w:val="single" w:sz="4" w:space="0" w:color="C9CCCF"/>
-              <w:bottom w:val="single" w:sz="4" w:space="0" w:color="C9CCCF"/>
-              <w:right w:val="single" w:sz="4" w:space="0" w:color="C9CCCF"/>
-            </w:tcBorders>
-            <w:tcMar>
-              <w:top w:w="80" w:type="dxa"/>
-              <w:left w:w="110" w:type="dxa"/>
-              <w:bottom w:w="80" w:type="dxa"/>
-              <w:right w:w="110" w:type="dxa"/>
-            </w:tcMar>
-          </w:tcPr>
-          <w:p>
-            <w:pPr>
-              <w:spacing w:line="270" w:lineRule="auto"/>
-            </w:pPr>
-          </w:p>
-        </w:tc>
-      </w:tr>
-      <w:tr>
-        <w:tc>
-          <w:tcPr>
-            <w:tcW w:w="600" w:type="dxa"/>
-            <w:tcBorders>
-              <w:top w:val="single" w:sz="4" w:space="0" w:color="C9CCCF"/>
-              <w:left w:val="single" w:sz="4" w:space="0" w:color="C9CCCF"/>
-              <w:bottom w:val="single" w:sz="4" w:space="0" w:color="C9CCCF"/>
-              <w:right w:val="single" w:sz="4" w:space="0" w:color="C9CCCF"/>
-            </w:tcBorders>
-            <w:tcMar>
-              <w:top w:w="80" w:type="dxa"/>
-              <w:left w:w="110" w:type="dxa"/>
-              <w:bottom w:w="80" w:type="dxa"/>
-              <w:right w:w="110" w:type="dxa"/>
-            </w:tcMar>
-          </w:tcPr>
-          <w:p>
-            <w:pPr>
-              <w:spacing w:line="270" w:lineRule="auto"/>
-            </w:pPr>
-            <w:r>
-              <w:rPr>
-                <w:sz w:val="18"/>
-                <w:szCs w:val="18"/>
-              </w:rPr>
-              <w:t>7</w:t>
-            </w:r>
-          </w:p>
-        </w:tc>
-        <w:tc>
-          <w:tcPr>
-            <w:tcW w:w="6760" w:type="dxa"/>
-            <w:tcBorders>
-              <w:top w:val="single" w:sz="4" w:space="0" w:color="C9CCCF"/>
-              <w:left w:val="single" w:sz="4" w:space="0" w:color="C9CCCF"/>
-              <w:bottom w:val="single" w:sz="4" w:space="0" w:color="C9CCCF"/>
-              <w:right w:val="single" w:sz="4" w:space="0" w:color="C9CCCF"/>
-            </w:tcBorders>
-            <w:tcMar>
-              <w:top w:w="80" w:type="dxa"/>
-              <w:left w:w="110" w:type="dxa"/>
-              <w:bottom w:w="80" w:type="dxa"/>
-              <w:right w:w="110" w:type="dxa"/>
-            </w:tcMar>
-          </w:tcPr>
-          <w:p>
-            <w:pPr>
-              <w:spacing w:line="270" w:lineRule="auto"/>
-            </w:pPr>
-          </w:p>
-        </w:tc>
-        <w:tc>
-          <w:tcPr>
-            <w:tcW w:w="2000" w:type="dxa"/>
-            <w:tcBorders>
-              <w:top w:val="single" w:sz="4" w:space="0" w:color="C9CCCF"/>
-              <w:left w:val="single" w:sz="4" w:space="0" w:color="C9CCCF"/>
-              <w:bottom w:val="single" w:sz="4" w:space="0" w:color="C9CCCF"/>
-              <w:right w:val="single" w:sz="4" w:space="0" w:color="C9CCCF"/>
-            </w:tcBorders>
-            <w:tcMar>
-              <w:top w:w="80" w:type="dxa"/>
-              <w:left w:w="110" w:type="dxa"/>
-              <w:bottom w:w="80" w:type="dxa"/>
-              <w:right w:w="110" w:type="dxa"/>
-            </w:tcMar>
-          </w:tcPr>
-          <w:p>
-            <w:pPr>
-              <w:spacing w:line="270" w:lineRule="auto"/>
-            </w:pPr>
-          </w:p>
-        </w:tc>
-      </w:tr>
-      <w:tr>
-        <w:tc>
-          <w:tcPr>
-            <w:tcW w:w="600" w:type="dxa"/>
-            <w:tcBorders>
-              <w:top w:val="single" w:sz="4" w:space="0" w:color="C9CCCF"/>
-              <w:left w:val="single" w:sz="4" w:space="0" w:color="C9CCCF"/>
-              <w:bottom w:val="single" w:sz="4" w:space="0" w:color="C9CCCF"/>
-              <w:right w:val="single" w:sz="4" w:space="0" w:color="C9CCCF"/>
-            </w:tcBorders>
-            <w:tcMar>
-              <w:top w:w="80" w:type="dxa"/>
-              <w:left w:w="110" w:type="dxa"/>
-              <w:bottom w:w="80" w:type="dxa"/>
-              <w:right w:w="110" w:type="dxa"/>
-            </w:tcMar>
-          </w:tcPr>
-          <w:p>
-            <w:pPr>
-              <w:spacing w:line="270" w:lineRule="auto"/>
-            </w:pPr>
-            <w:r>
-              <w:rPr>
-                <w:sz w:val="18"/>
-                <w:szCs w:val="18"/>
-              </w:rPr>
-              <w:t>8</w:t>
-            </w:r>
-          </w:p>
-        </w:tc>
-        <w:tc>
-          <w:tcPr>
-            <w:tcW w:w="6760" w:type="dxa"/>
-            <w:tcBorders>
-              <w:top w:val="single" w:sz="4" w:space="0" w:color="C9CCCF"/>
-              <w:left w:val="single" w:sz="4" w:space="0" w:color="C9CCCF"/>
-              <w:bottom w:val="single" w:sz="4" w:space="0" w:color="C9CCCF"/>
-              <w:right w:val="single" w:sz="4" w:space="0" w:color="C9CCCF"/>
-            </w:tcBorders>
-            <w:tcMar>
-              <w:top w:w="80" w:type="dxa"/>
-              <w:left w:w="110" w:type="dxa"/>
-              <w:bottom w:w="80" w:type="dxa"/>
-              <w:right w:w="110" w:type="dxa"/>
-            </w:tcMar>
-          </w:tcPr>
-          <w:p>
-            <w:pPr>
-              <w:spacing w:line="270" w:lineRule="auto"/>
-            </w:pPr>
-          </w:p>
-        </w:tc>
-        <w:tc>
-          <w:tcPr>
-            <w:tcW w:w="2000" w:type="dxa"/>
-            <w:tcBorders>
-              <w:top w:val="single" w:sz="4" w:space="0" w:color="C9CCCF"/>
-              <w:left w:val="single" w:sz="4" w:space="0" w:color="C9CCCF"/>
-              <w:bottom w:val="single" w:sz="4" w:space="0" w:color="C9CCCF"/>
-              <w:right w:val="single" w:sz="4" w:space="0" w:color="C9CCCF"/>
-            </w:tcBorders>
-            <w:tcMar>
-              <w:top w:w="80" w:type="dxa"/>
-              <w:left w:w="110" w:type="dxa"/>
-              <w:bottom w:w="80" w:type="dxa"/>
-              <w:right w:w="110" w:type="dxa"/>
-            </w:tcMar>
-          </w:tcPr>
-          <w:p>
-            <w:pPr>
-              <w:spacing w:line="270" w:lineRule="auto"/>
-            </w:pPr>
-          </w:p>
-        </w:tc>
-      </w:tr>
-      <w:tr>
-        <w:tc>
-          <w:tcPr>
-            <w:tcW w:w="600" w:type="dxa"/>
-            <w:tcBorders>
-              <w:top w:val="single" w:sz="4" w:space="0" w:color="C9CCCF"/>
-              <w:left w:val="single" w:sz="4" w:space="0" w:color="C9CCCF"/>
-              <w:bottom w:val="single" w:sz="4" w:space="0" w:color="C9CCCF"/>
-              <w:right w:val="single" w:sz="4" w:space="0" w:color="C9CCCF"/>
-            </w:tcBorders>
-            <w:tcMar>
-              <w:top w:w="80" w:type="dxa"/>
-              <w:left w:w="110" w:type="dxa"/>
-              <w:bottom w:w="80" w:type="dxa"/>
-              <w:right w:w="110" w:type="dxa"/>
-            </w:tcMar>
-          </w:tcPr>
-          <w:p>
-            <w:pPr>
-              <w:spacing w:line="270" w:lineRule="auto"/>
-            </w:pPr>
-            <w:r>
-              <w:rPr>
-                <w:sz w:val="18"/>
-                <w:szCs w:val="18"/>
-              </w:rPr>
-              <w:t>9</w:t>
-            </w:r>
-          </w:p>
-        </w:tc>
-        <w:tc>
-          <w:tcPr>
-            <w:tcW w:w="6760" w:type="dxa"/>
-            <w:tcBorders>
-              <w:top w:val="single" w:sz="4" w:space="0" w:color="C9CCCF"/>
-              <w:left w:val="single" w:sz="4" w:space="0" w:color="C9CCCF"/>
-              <w:bottom w:val="single" w:sz="4" w:space="0" w:color="C9CCCF"/>
-              <w:right w:val="single" w:sz="4" w:space="0" w:color="C9CCCF"/>
-            </w:tcBorders>
-            <w:tcMar>
-              <w:top w:w="80" w:type="dxa"/>
-              <w:left w:w="110" w:type="dxa"/>
-              <w:bottom w:w="80" w:type="dxa"/>
-              <w:right w:w="110" w:type="dxa"/>
-            </w:tcMar>
-          </w:tcPr>
-          <w:p>
-            <w:pPr>
-              <w:spacing w:line="270" w:lineRule="auto"/>
-            </w:pPr>
-          </w:p>
-        </w:tc>
-        <w:tc>
-          <w:tcPr>
-            <w:tcW w:w="2000" w:type="dxa"/>
-            <w:tcBorders>
-              <w:top w:val="single" w:sz="4" w:space="0" w:color="C9CCCF"/>
-              <w:left w:val="single" w:sz="4" w:space="0" w:color="C9CCCF"/>
-              <w:bottom w:val="single" w:sz="4" w:space="0" w:color="C9CCCF"/>
-              <w:right w:val="single" w:sz="4" w:space="0" w:color="C9CCCF"/>
-            </w:tcBorders>
-            <w:tcMar>
-              <w:top w:w="80" w:type="dxa"/>
-              <w:left w:w="110" w:type="dxa"/>
-              <w:bottom w:w="80" w:type="dxa"/>
-              <w:right w:w="110" w:type="dxa"/>
-            </w:tcMar>
-          </w:tcPr>
-          <w:p>
-            <w:pPr>
-              <w:spacing w:line="270" w:lineRule="auto"/>
-            </w:pPr>
-          </w:p>
-        </w:tc>
-      </w:tr>
-      <w:tr>
-        <w:tc>
-          <w:tcPr>
-            <w:tcW w:w="600" w:type="dxa"/>
-            <w:tcBorders>
-              <w:top w:val="single" w:sz="4" w:space="0" w:color="C9CCCF"/>
-              <w:left w:val="single" w:sz="4" w:space="0" w:color="C9CCCF"/>
-              <w:bottom w:val="single" w:sz="4" w:space="0" w:color="C9CCCF"/>
-              <w:right w:val="single" w:sz="4" w:space="0" w:color="C9CCCF"/>
-            </w:tcBorders>
-            <w:tcMar>
-              <w:top w:w="80" w:type="dxa"/>
-              <w:left w:w="110" w:type="dxa"/>
-              <w:bottom w:w="80" w:type="dxa"/>
-              <w:right w:w="110" w:type="dxa"/>
-            </w:tcMar>
-          </w:tcPr>
-          <w:p>
-            <w:pPr>
-              <w:spacing w:line="270" w:lineRule="auto"/>
-            </w:pPr>
-            <w:r>
-              <w:rPr>
-                <w:sz w:val="18"/>
-                <w:szCs w:val="18"/>
-              </w:rPr>
-              <w:t>10</w:t>
-            </w:r>
-          </w:p>
-        </w:tc>
-        <w:tc>
-          <w:tcPr>
-            <w:tcW w:w="6760" w:type="dxa"/>
-            <w:tcBorders>
-              <w:top w:val="single" w:sz="4" w:space="0" w:color="C9CCCF"/>
-              <w:left w:val="single" w:sz="4" w:space="0" w:color="C9CCCF"/>
-              <w:bottom w:val="single" w:sz="4" w:space="0" w:color="C9CCCF"/>
-              <w:right w:val="single" w:sz="4" w:space="0" w:color="C9CCCF"/>
-            </w:tcBorders>
-            <w:tcMar>
-              <w:top w:w="80" w:type="dxa"/>
-              <w:left w:w="110" w:type="dxa"/>
-              <w:bottom w:w="80" w:type="dxa"/>
-              <w:right w:w="110" w:type="dxa"/>
-            </w:tcMar>
-          </w:tcPr>
-          <w:p>
-            <w:pPr>
-              <w:spacing w:line="270" w:lineRule="auto"/>
-            </w:pPr>
-          </w:p>
-        </w:tc>
-        <w:tc>
-          <w:tcPr>
-            <w:tcW w:w="2000" w:type="dxa"/>
-            <w:tcBorders>
-              <w:top w:val="single" w:sz="4" w:space="0" w:color="C9CCCF"/>
-              <w:left w:val="single" w:sz="4" w:space="0" w:color="C9CCCF"/>
-              <w:bottom w:val="single" w:sz="4" w:space="0" w:color="C9CCCF"/>
-              <w:right w:val="single" w:sz="4" w:space="0" w:color="C9CCCF"/>
-            </w:tcBorders>
-            <w:tcMar>
-              <w:top w:w="80" w:type="dxa"/>
-              <w:left w:w="110" w:type="dxa"/>
-              <w:bottom w:w="80" w:type="dxa"/>
-              <w:right w:w="110" w:type="dxa"/>
-            </w:tcMar>
-          </w:tcPr>
-          <w:p>
-            <w:pPr>
-              <w:spacing w:line="270" w:lineRule="auto"/>
-            </w:pPr>
-          </w:p>
-        </w:tc>
-      </w:tr>
-      <w:tr>
-        <w:tc>
-          <w:tcPr>
-            <w:tcW w:w="600" w:type="dxa"/>
-            <w:tcBorders>
-              <w:top w:val="single" w:sz="4" w:space="0" w:color="C9CCCF"/>
-              <w:left w:val="single" w:sz="4" w:space="0" w:color="C9CCCF"/>
-              <w:bottom w:val="single" w:sz="4" w:space="0" w:color="C9CCCF"/>
-              <w:right w:val="single" w:sz="4" w:space="0" w:color="C9CCCF"/>
-            </w:tcBorders>
-            <w:tcMar>
-              <w:top w:w="80" w:type="dxa"/>
-              <w:left w:w="110" w:type="dxa"/>
-              <w:bottom w:w="80" w:type="dxa"/>
-              <w:right w:w="110" w:type="dxa"/>
-            </w:tcMar>
-          </w:tcPr>
-          <w:p>
-            <w:pPr>
-              <w:spacing w:line="270" w:lineRule="auto"/>
-            </w:pPr>
-            <w:r>
-              <w:rPr>
-                <w:sz w:val="18"/>
-                <w:szCs w:val="18"/>
-              </w:rPr>
-              <w:t>11</w:t>
-            </w:r>
-          </w:p>
-        </w:tc>
-        <w:tc>
-          <w:tcPr>
-            <w:tcW w:w="6760" w:type="dxa"/>
-            <w:tcBorders>
-              <w:top w:val="single" w:sz="4" w:space="0" w:color="C9CCCF"/>
-              <w:left w:val="single" w:sz="4" w:space="0" w:color="C9CCCF"/>
-              <w:bottom w:val="single" w:sz="4" w:space="0" w:color="C9CCCF"/>
-              <w:right w:val="single" w:sz="4" w:space="0" w:color="C9CCCF"/>
-            </w:tcBorders>
-            <w:tcMar>
-              <w:top w:w="80" w:type="dxa"/>
-              <w:left w:w="110" w:type="dxa"/>
-              <w:bottom w:w="80" w:type="dxa"/>
-              <w:right w:w="110" w:type="dxa"/>
-            </w:tcMar>
-          </w:tcPr>
-          <w:p>
-            <w:pPr>
-              <w:spacing w:line="270" w:lineRule="auto"/>
-            </w:pPr>
-          </w:p>
-        </w:tc>
-        <w:tc>
-          <w:tcPr>
-            <w:tcW w:w="2000" w:type="dxa"/>
-            <w:tcBorders>
-              <w:top w:val="single" w:sz="4" w:space="0" w:color="C9CCCF"/>
-              <w:left w:val="single" w:sz="4" w:space="0" w:color="C9CCCF"/>
-              <w:bottom w:val="single" w:sz="4" w:space="0" w:color="C9CCCF"/>
-              <w:right w:val="single" w:sz="4" w:space="0" w:color="C9CCCF"/>
-            </w:tcBorders>
-            <w:tcMar>
-              <w:top w:w="80" w:type="dxa"/>
-              <w:left w:w="110" w:type="dxa"/>
-              <w:bottom w:w="80" w:type="dxa"/>
-              <w:right w:w="110" w:type="dxa"/>
-            </w:tcMar>
-          </w:tcPr>
-          <w:p>
-            <w:pPr>
-              <w:spacing w:line="270" w:lineRule="auto"/>
-            </w:pPr>
-          </w:p>
-        </w:tc>
-      </w:tr>
-      <w:tr>
-        <w:tc>
-          <w:tcPr>
-            <w:tcW w:w="600" w:type="dxa"/>
-            <w:tcBorders>
-              <w:top w:val="single" w:sz="4" w:space="0" w:color="C9CCCF"/>
-              <w:left w:val="single" w:sz="4" w:space="0" w:color="C9CCCF"/>
-              <w:bottom w:val="single" w:sz="4" w:space="0" w:color="C9CCCF"/>
-              <w:right w:val="single" w:sz="4" w:space="0" w:color="C9CCCF"/>
-            </w:tcBorders>
-            <w:tcMar>
-              <w:top w:w="80" w:type="dxa"/>
-              <w:left w:w="110" w:type="dxa"/>
-              <w:bottom w:w="80" w:type="dxa"/>
-              <w:right w:w="110" w:type="dxa"/>
-            </w:tcMar>
-          </w:tcPr>
-          <w:p>
-            <w:pPr>
-              <w:spacing w:line="270" w:lineRule="auto"/>
-            </w:pPr>
-            <w:r>
-              <w:rPr>
-                <w:sz w:val="18"/>
-                <w:szCs w:val="18"/>
-              </w:rPr>
-              <w:t>12</w:t>
-            </w:r>
-          </w:p>
-        </w:tc>
-        <w:tc>
-          <w:tcPr>
-            <w:tcW w:w="6760" w:type="dxa"/>
-            <w:tcBorders>
-              <w:top w:val="single" w:sz="4" w:space="0" w:color="C9CCCF"/>
-              <w:left w:val="single" w:sz="4" w:space="0" w:color="C9CCCF"/>
-              <w:bottom w:val="single" w:sz="4" w:space="0" w:color="C9CCCF"/>
-              <w:right w:val="single" w:sz="4" w:space="0" w:color="C9CCCF"/>
-            </w:tcBorders>
-            <w:tcMar>
-              <w:top w:w="80" w:type="dxa"/>
-              <w:left w:w="110" w:type="dxa"/>
-              <w:bottom w:w="80" w:type="dxa"/>
-              <w:right w:w="110" w:type="dxa"/>
-            </w:tcMar>
-          </w:tcPr>
-          <w:p>
-            <w:pPr>
-              <w:spacing w:line="270" w:lineRule="auto"/>
-            </w:pPr>
-          </w:p>
-        </w:tc>
-        <w:tc>
-          <w:tcPr>
-            <w:tcW w:w="2000" w:type="dxa"/>
-            <w:tcBorders>
-              <w:top w:val="single" w:sz="4" w:space="0" w:color="C9CCCF"/>
-              <w:left w:val="single" w:sz="4" w:space="0" w:color="C9CCCF"/>
-              <w:bottom w:val="single" w:sz="4" w:space="0" w:color="C9CCCF"/>
-              <w:right w:val="single" w:sz="4" w:space="0" w:color="C9CCCF"/>
-            </w:tcBorders>
-            <w:tcMar>
-              <w:top w:w="80" w:type="dxa"/>
-              <w:left w:w="110" w:type="dxa"/>
-              <w:bottom w:w="80" w:type="dxa"/>
-              <w:right w:w="110" w:type="dxa"/>
-            </w:tcMar>
-          </w:tcPr>
-          <w:p>
-            <w:pPr>
-              <w:spacing w:line="270" w:lineRule="auto"/>
-            </w:pPr>
-          </w:p>
-        </w:tc>
-      </w:tr>
-      <w:tr>
-        <w:tc>
-          <w:tcPr>
-            <w:tcW w:w="600" w:type="dxa"/>
-            <w:tcBorders>
-              <w:top w:val="single" w:sz="4" w:space="0" w:color="C9CCCF"/>
-              <w:left w:val="single" w:sz="4" w:space="0" w:color="C9CCCF"/>
-              <w:bottom w:val="single" w:sz="4" w:space="0" w:color="C9CCCF"/>
-              <w:right w:val="single" w:sz="4" w:space="0" w:color="C9CCCF"/>
-            </w:tcBorders>
-            <w:tcMar>
-              <w:top w:w="80" w:type="dxa"/>
-              <w:left w:w="110" w:type="dxa"/>
-              <w:bottom w:w="80" w:type="dxa"/>
-              <w:right w:w="110" w:type="dxa"/>
-            </w:tcMar>
-          </w:tcPr>
-          <w:p>
-            <w:pPr>
-              <w:spacing w:line="270" w:lineRule="auto"/>
-            </w:pPr>
-            <w:r>
-              <w:rPr>
-                <w:sz w:val="18"/>
-                <w:szCs w:val="18"/>
-              </w:rPr>
-              <w:t>13</w:t>
-            </w:r>
-          </w:p>
-        </w:tc>
-        <w:tc>
-          <w:tcPr>
-            <w:tcW w:w="6760" w:type="dxa"/>
-            <w:tcBorders>
-              <w:top w:val="single" w:sz="4" w:space="0" w:color="C9CCCF"/>
-              <w:left w:val="single" w:sz="4" w:space="0" w:color="C9CCCF"/>
-              <w:bottom w:val="single" w:sz="4" w:space="0" w:color="C9CCCF"/>
-              <w:right w:val="single" w:sz="4" w:space="0" w:color="C9CCCF"/>
-            </w:tcBorders>
-            <w:tcMar>
-              <w:top w:w="80" w:type="dxa"/>
-              <w:left w:w="110" w:type="dxa"/>
-              <w:bottom w:w="80" w:type="dxa"/>
-              <w:right w:w="110" w:type="dxa"/>
-            </w:tcMar>
-          </w:tcPr>
-          <w:p>
-            <w:pPr>
-              <w:spacing w:line="270" w:lineRule="auto"/>
-            </w:pPr>
-          </w:p>
-        </w:tc>
-        <w:tc>
-          <w:tcPr>
-            <w:tcW w:w="2000" w:type="dxa"/>
-            <w:tcBorders>
-              <w:top w:val="single" w:sz="4" w:space="0" w:color="C9CCCF"/>
-              <w:left w:val="single" w:sz="4" w:space="0" w:color="C9CCCF"/>
-              <w:bottom w:val="single" w:sz="4" w:space="0" w:color="C9CCCF"/>
-              <w:right w:val="single" w:sz="4" w:space="0" w:color="C9CCCF"/>
-            </w:tcBorders>
-            <w:tcMar>
-              <w:top w:w="80" w:type="dxa"/>
-              <w:left w:w="110" w:type="dxa"/>
-              <w:bottom w:w="80" w:type="dxa"/>
-              <w:right w:w="110" w:type="dxa"/>
-            </w:tcMar>
-          </w:tcPr>
-          <w:p>
-            <w:pPr>
-              <w:spacing w:line="270" w:lineRule="auto"/>
-            </w:pPr>
-          </w:p>
-        </w:tc>
-      </w:tr>
-    </w:tbl>
-    <w:p/>
     <w:sectPr>
-      <w:footerReference w:type="default" r:id="rId7"/>
+      <w:footerReference w:type="default" r:id="rId8"/>
       <w:pgSz w:w="12240" w:h="15840"/>
       <w:pgMar w:top="1300" w:right="1440" w:bottom="1300" w:left="1440" w:header="708" w:footer="708" w:gutter="0"/>
       <w:cols w:space="720"/>
@@ -5035,6 +3587,7 @@
     <w:pPr>
       <w:jc w:val="right"/>
     </w:pPr>
+    <w:proofErr w:type="spellStart"/>
     <w:r>
       <w:rPr>
         <w:rFonts w:ascii="JetBrains Mono" w:eastAsia="JetBrains Mono" w:hAnsi="JetBrains Mono" w:cs="JetBrains Mono"/>
@@ -5042,7 +3595,17 @@
         <w:sz w:val="14"/>
         <w:szCs w:val="14"/>
       </w:rPr>
-      <w:t xml:space="preserve">TekRevol · The Strata Method · </w:t>
+      <w:t>TekRevol</w:t>
+    </w:r>
+    <w:proofErr w:type="spellEnd"/>
+    <w:r>
+      <w:rPr>
+        <w:rFonts w:ascii="JetBrains Mono" w:eastAsia="JetBrains Mono" w:hAnsi="JetBrains Mono" w:cs="JetBrains Mono"/>
+        <w:color w:val="5E6166"/>
+        <w:sz w:val="14"/>
+        <w:szCs w:val="14"/>
+      </w:rPr>
+      <w:t xml:space="preserve"> · The Strata Method · </w:t>
     </w:r>
     <w:r>
       <w:rPr>
@@ -5176,7 +3739,7 @@
     <w:nsid w:val="3D6F0E2E"/>
     <w:multiLevelType w:val="hybridMultilevel"/>
     <w:tmpl w:val="47A88192"/>
-    <w:lvl w:ilvl="0" w:tplc="44D2A8CE" w:tentative="1">
+    <w:lvl w:ilvl="0" w:tplc="44D2A8CE">
       <w:start w:val="1"/>
       <w:numFmt w:val="decimal"/>
       <w:lvlText w:val="%1."/>

</xml_diff>